<commit_message>
feat: Texto topico 2 imagem necessaria
</commit_message>
<xml_diff>
--- a/docs/Template - Fase 2 - Projeto em Business Intelligence e Analytics.docx
+++ b/docs/Template - Fase 2 - Projeto em Business Intelligence e Analytics.docx
@@ -250,7 +250,14 @@
           <w:sz w:val="24"/>
         </w:rPr>
         <w:tab/>
-        <w:t>Os indicadores estratégicos foram definidos a partir das hipóteses formuladas na primeira fase do projeto, com o objetivo de monitorar o risco de rebaixamento e apoiar decisões de planejamento esportivo e financeiro do clube ao longo da temporada. Seis KPIs foram utilizadas no dashboard sendo elas:</w:t>
+      </w:r>
+      <w:r>
+        <w:rPr>
+          <w:rFonts w:ascii="Arial" w:hAnsi="Arial" w:cs="Arial"/>
+          <w:color w:val="000000" w:themeColor="text1"/>
+          <w:sz w:val="24"/>
+        </w:rPr>
+        <w:t>Os indicadores foram definidos com o objetivo de transformar as previsões de risco de rebaixamento em informações de apoio à análise do desempenho dos clubes. O dashboard apresenta seis indicadores principais:</w:t>
       </w:r>
     </w:p>
     <w:p>
@@ -803,33 +810,85 @@
         <w:spacing w:after="0" w:line="240" w:lineRule="auto"/>
         <w:rPr>
           <w:color w:val="000000" w:themeColor="text1"/>
-          <w:sz w:val="24"/>
-        </w:rPr>
-      </w:pPr>
-      <w:r>
-        <w:rPr>
-          <w:color w:val="000000" w:themeColor="text1"/>
-          <w:sz w:val="24"/>
-        </w:rPr>
-        <w:t xml:space="preserve">Insira aqui </w:t>
-      </w:r>
-      <w:r>
-        <w:rPr>
-          <w:color w:val="000000" w:themeColor="text1"/>
-          <w:sz w:val="24"/>
-        </w:rPr>
-        <w:t>o diagrama com os componentes</w:t>
-      </w:r>
-      <w:r>
-        <w:rPr>
-          <w:color w:val="000000" w:themeColor="text1"/>
-          <w:sz w:val="24"/>
-        </w:rPr>
-        <w:t>.</w:t>
+          <w:sz w:val="28"/>
+          <w:szCs w:val="24"/>
+        </w:rPr>
+      </w:pPr>
+      <w:r>
+        <w:rPr>
+          <w:color w:val="000000" w:themeColor="text1"/>
+          <w:sz w:val="24"/>
+        </w:rPr>
+        <w:tab/>
+      </w:r>
+      <w:r>
+        <w:rPr>
+          <w:color w:val="000000" w:themeColor="text1"/>
+          <w:sz w:val="28"/>
+          <w:szCs w:val="24"/>
+        </w:rPr>
+        <w:t>A soluçao foi estruturada em etapas de preparação dos dados, modelagem preditiva e visualização dos resultados. Os dados utilizados no projeto foram incialmente analisados e preparados no Python, resultando em uma base analítica organizada em nível clube e temporada. Essa base foi utilizada como entrada para o notebook de modelagem preditiva na Fase 2.</w:t>
       </w:r>
     </w:p>
     <w:p>
       <w:pPr>
+        <w:spacing w:after="0" w:line="240" w:lineRule="auto"/>
+        <w:rPr>
+          <w:color w:val="000000" w:themeColor="text1"/>
+          <w:sz w:val="28"/>
+          <w:szCs w:val="24"/>
+        </w:rPr>
+      </w:pPr>
+      <w:r>
+        <w:rPr>
+          <w:color w:val="000000" w:themeColor="text1"/>
+          <w:sz w:val="28"/>
+          <w:szCs w:val="24"/>
+        </w:rPr>
+        <w:tab/>
+        <w:t>Na etapa de modelgaem, foi utilizda Regressão Logística para classificação do risco de rebaixamento. A avaliação foi realizada respeitando a ordem temporal de cada temporada, por meio de validação cruzada temporal com janela expansiva. Essa abordagem evita embaralhamento dos dados históricos e permite avaliar o modelo utilizando temporadas futuras em relaçao ao período utilizando para treinamento.</w:t>
+      </w:r>
+    </w:p>
+    <w:p>
+      <w:pPr>
+        <w:spacing w:after="0" w:line="240" w:lineRule="auto"/>
+        <w:rPr>
+          <w:color w:val="000000" w:themeColor="text1"/>
+          <w:sz w:val="28"/>
+          <w:szCs w:val="24"/>
+        </w:rPr>
+      </w:pPr>
+      <w:r>
+        <w:rPr>
+          <w:color w:val="000000" w:themeColor="text1"/>
+          <w:sz w:val="28"/>
+          <w:szCs w:val="24"/>
+        </w:rPr>
+        <w:tab/>
+        <w:t>Após  a validação, foi construído o modelo utilizado para gerar as previsões temporais da temporada de 2025. O modelo final utiliza a posição final do clube na temporada como variável explicativa e gera uma probabilidade prevista de rebaixamento. Os resultados forma exportados para um arquivo CSV consolidado, contendo histocio eas previsoes, que posteriormente é utilizado como fonte de dados no Tableau.</w:t>
+      </w:r>
+    </w:p>
+    <w:p>
+      <w:pPr>
+        <w:spacing w:after="0" w:line="240" w:lineRule="auto"/>
+        <w:rPr>
+          <w:color w:val="000000" w:themeColor="text1"/>
+          <w:sz w:val="28"/>
+          <w:szCs w:val="24"/>
+        </w:rPr>
+      </w:pPr>
+      <w:r>
+        <w:rPr>
+          <w:color w:val="000000" w:themeColor="text1"/>
+          <w:sz w:val="28"/>
+          <w:szCs w:val="24"/>
+        </w:rPr>
+        <w:tab/>
+        <w:t>Insrir uma imagem, aqui.</w:t>
+      </w:r>
+    </w:p>
+    <w:p>
+      <w:pPr>
         <w:spacing w:before="720" w:after="0" w:line="240" w:lineRule="auto"/>
         <w:jc w:val="both"/>
         <w:rPr>
@@ -893,6 +952,7 @@
           <w:color w:val="7B7B7B" w:themeColor="accent3" w:themeShade="BF"/>
           <w:szCs w:val="21"/>
         </w:rPr>
+        <w:lastRenderedPageBreak/>
         <w:t>Descreva a solução implementada. Link para o código fonte, dicionário de dados, dashboards e análises realizadas.</w:t>
       </w:r>
       <w:r>
@@ -3011,7 +3071,6 @@
   <w:style w:type="character" w:default="1" w:styleId="Tipodeletrapredefinidodopargrafo">
     <w:name w:val="Default Paragraph Font"/>
     <w:uiPriority w:val="1"/>
-    <w:semiHidden/>
     <w:unhideWhenUsed/>
   </w:style>
   <w:style w:type="table" w:default="1" w:styleId="Tabelanormal">
@@ -3541,14 +3600,19 @@
 </file>
 
 <file path=customXml/item1.xml><?xml version="1.0" encoding="utf-8"?>
-<p:properties xmlns:p="http://schemas.microsoft.com/office/2006/metadata/properties" xmlns:xsi="http://www.w3.org/2001/XMLSchema-instance" xmlns:pc="http://schemas.microsoft.com/office/infopath/2007/PartnerControls">
-  <documentManagement>
-    <_activity xmlns="73bd2b1f-886a-4f1d-b0bb-23f49d491aa9" xsi:nil="true"/>
-  </documentManagement>
-</p:properties>
+<b:Sources xmlns:b="http://schemas.openxmlformats.org/officeDocument/2006/bibliography" xmlns="http://schemas.openxmlformats.org/officeDocument/2006/bibliography" SelectedStyle="\APASixthEditionOfficeOnline.xsl" StyleName="APA" Version="6"/>
 </file>
 
 <file path=customXml/item2.xml><?xml version="1.0" encoding="utf-8"?>
+<?mso-contentType ?>
+<FormTemplates xmlns="http://schemas.microsoft.com/sharepoint/v3/contenttype/forms">
+  <Display>DocumentLibraryForm</Display>
+  <Edit>DocumentLibraryForm</Edit>
+  <New>DocumentLibraryForm</New>
+</FormTemplates>
+</file>
+
+<file path=customXml/item3.xml><?xml version="1.0" encoding="utf-8"?>
 <ct:contentTypeSchema xmlns:ct="http://schemas.microsoft.com/office/2006/metadata/contentType" xmlns:ma="http://schemas.microsoft.com/office/2006/metadata/properties/metaAttributes" ct:_="" ma:_="" ma:contentTypeName="Documento" ma:contentTypeID="0x010100B048A1A6D184364FB502BBB6EBF2C3D9" ma:contentTypeVersion="14" ma:contentTypeDescription="Crie um novo documento." ma:contentTypeScope="" ma:versionID="d7146710810563b9c6e4c1a91b60f5f9">
   <xsd:schema xmlns:xsd="http://www.w3.org/2001/XMLSchema" xmlns:xs="http://www.w3.org/2001/XMLSchema" xmlns:p="http://schemas.microsoft.com/office/2006/metadata/properties" xmlns:ns3="73bd2b1f-886a-4f1d-b0bb-23f49d491aa9" xmlns:ns4="85818a3c-b8e7-4f75-b80a-610982c277d3" targetNamespace="http://schemas.microsoft.com/office/2006/metadata/properties" ma:root="true" ma:fieldsID="8b8875638ef7369d6012dd60a980de1b" ns3:_="" ns4:_="">
     <xsd:import namespace="73bd2b1f-886a-4f1d-b0bb-23f49d491aa9"/>
@@ -3777,30 +3841,31 @@
 </ct:contentTypeSchema>
 </file>
 
-<file path=customXml/item3.xml><?xml version="1.0" encoding="utf-8"?>
-<?mso-contentType ?>
-<FormTemplates xmlns="http://schemas.microsoft.com/sharepoint/v3/contenttype/forms">
-  <Display>DocumentLibraryForm</Display>
-  <Edit>DocumentLibraryForm</Edit>
-  <New>DocumentLibraryForm</New>
-</FormTemplates>
-</file>
-
 <file path=customXml/item4.xml><?xml version="1.0" encoding="utf-8"?>
-<b:Sources xmlns:b="http://schemas.openxmlformats.org/officeDocument/2006/bibliography" xmlns="http://schemas.openxmlformats.org/officeDocument/2006/bibliography" SelectedStyle="\APASixthEditionOfficeOnline.xsl" StyleName="APA" Version="6"/>
+<p:properties xmlns:p="http://schemas.microsoft.com/office/2006/metadata/properties" xmlns:xsi="http://www.w3.org/2001/XMLSchema-instance" xmlns:pc="http://schemas.microsoft.com/office/infopath/2007/PartnerControls">
+  <documentManagement>
+    <_activity xmlns="73bd2b1f-886a-4f1d-b0bb-23f49d491aa9" xsi:nil="true"/>
+  </documentManagement>
+</p:properties>
 </file>
 
 <file path=customXml/itemProps1.xml><?xml version="1.0" encoding="utf-8"?>
-<ds:datastoreItem xmlns:ds="http://schemas.openxmlformats.org/officeDocument/2006/customXml" ds:itemID="{10811A0B-354D-477E-AF27-C929DD9532C2}">
+<ds:datastoreItem xmlns:ds="http://schemas.openxmlformats.org/officeDocument/2006/customXml" ds:itemID="{F61111CE-2DDF-46E8-9D66-B3D8C921A39E}">
   <ds:schemaRefs>
-    <ds:schemaRef ds:uri="http://schemas.microsoft.com/office/2006/metadata/properties"/>
-    <ds:schemaRef ds:uri="http://schemas.microsoft.com/office/infopath/2007/PartnerControls"/>
-    <ds:schemaRef ds:uri="73bd2b1f-886a-4f1d-b0bb-23f49d491aa9"/>
+    <ds:schemaRef ds:uri="http://schemas.openxmlformats.org/officeDocument/2006/bibliography"/>
   </ds:schemaRefs>
 </ds:datastoreItem>
 </file>
 
 <file path=customXml/itemProps2.xml><?xml version="1.0" encoding="utf-8"?>
+<ds:datastoreItem xmlns:ds="http://schemas.openxmlformats.org/officeDocument/2006/customXml" ds:itemID="{0593B9FC-456C-46BA-ABE7-4E86A6CE6864}">
+  <ds:schemaRefs>
+    <ds:schemaRef ds:uri="http://schemas.microsoft.com/sharepoint/v3/contenttype/forms"/>
+  </ds:schemaRefs>
+</ds:datastoreItem>
+</file>
+
+<file path=customXml/itemProps3.xml><?xml version="1.0" encoding="utf-8"?>
 <ds:datastoreItem xmlns:ds="http://schemas.openxmlformats.org/officeDocument/2006/customXml" ds:itemID="{D06ADA8E-DF43-49D2-A0A1-50B9B3A2B035}">
   <ds:schemaRefs>
     <ds:schemaRef ds:uri="http://schemas.microsoft.com/office/2006/metadata/contentType"/>
@@ -3819,18 +3884,12 @@
 </ds:datastoreItem>
 </file>
 
-<file path=customXml/itemProps3.xml><?xml version="1.0" encoding="utf-8"?>
-<ds:datastoreItem xmlns:ds="http://schemas.openxmlformats.org/officeDocument/2006/customXml" ds:itemID="{0593B9FC-456C-46BA-ABE7-4E86A6CE6864}">
+<file path=customXml/itemProps4.xml><?xml version="1.0" encoding="utf-8"?>
+<ds:datastoreItem xmlns:ds="http://schemas.openxmlformats.org/officeDocument/2006/customXml" ds:itemID="{10811A0B-354D-477E-AF27-C929DD9532C2}">
   <ds:schemaRefs>
-    <ds:schemaRef ds:uri="http://schemas.microsoft.com/sharepoint/v3/contenttype/forms"/>
-  </ds:schemaRefs>
-</ds:datastoreItem>
-</file>
-
-<file path=customXml/itemProps4.xml><?xml version="1.0" encoding="utf-8"?>
-<ds:datastoreItem xmlns:ds="http://schemas.openxmlformats.org/officeDocument/2006/customXml" ds:itemID="{F61111CE-2DDF-46E8-9D66-B3D8C921A39E}">
-  <ds:schemaRefs>
-    <ds:schemaRef ds:uri="http://schemas.openxmlformats.org/officeDocument/2006/bibliography"/>
+    <ds:schemaRef ds:uri="http://schemas.microsoft.com/office/2006/metadata/properties"/>
+    <ds:schemaRef ds:uri="http://schemas.microsoft.com/office/infopath/2007/PartnerControls"/>
+    <ds:schemaRef ds:uri="73bd2b1f-886a-4f1d-b0bb-23f49d491aa9"/>
   </ds:schemaRefs>
 </ds:datastoreItem>
 </file>
</xml_diff>

<commit_message>
feat: melhoria de texto no template e mais uma adição no gitignore
</commit_message>
<xml_diff>
--- a/docs/Template - Fase 2 - Projeto em Business Intelligence e Analytics.docx
+++ b/docs/Template - Fase 2 - Projeto em Business Intelligence e Analytics.docx
@@ -138,53 +138,7 @@
           <w:b/>
           <w:color w:val="FFFFFF" w:themeColor="background1"/>
         </w:rPr>
-        <w:t xml:space="preserve">Insira aqui seu nome  </w:t>
-      </w:r>
-    </w:p>
-    <w:p>
-      <w:pPr>
-        <w:spacing w:before="480" w:after="0" w:line="240" w:lineRule="auto"/>
-        <w:rPr>
-          <w:color w:val="963264"/>
-        </w:rPr>
-      </w:pPr>
-      <w:r>
-        <w:rPr>
-          <w:b/>
-          <w:color w:val="963264"/>
-        </w:rPr>
-        <w:t>Atenção:</w:t>
-      </w:r>
-      <w:r>
-        <w:rPr>
-          <w:color w:val="963264"/>
-        </w:rPr>
-        <w:t xml:space="preserve"> </w:t>
-      </w:r>
-      <w:r>
-        <w:rPr>
-          <w:color w:val="963264"/>
-        </w:rPr>
-        <w:t>U</w:t>
-      </w:r>
-      <w:r>
-        <w:rPr>
-          <w:color w:val="963264"/>
-        </w:rPr>
-        <w:t xml:space="preserve">tilize o template complementar (Template_Projeto_Fase 2_Apresentacao_Executiva) para estruturar a </w:t>
-      </w:r>
-      <w:r>
-        <w:rPr>
-          <w:b/>
-          <w:color w:val="963264"/>
-        </w:rPr>
-        <w:t>APRESENTAÇÃO EXECUTIVA</w:t>
-      </w:r>
-      <w:r>
-        <w:rPr>
-          <w:color w:val="963264"/>
-        </w:rPr>
-        <w:t>.</w:t>
+        <w:t>Felipe Pinheiro Fossá</w:t>
       </w:r>
     </w:p>
     <w:p>
@@ -292,31 +246,70 @@
           <w:color w:val="000000" w:themeColor="text1"/>
           <w:sz w:val="24"/>
         </w:rPr>
-        <w:t>KPI 1 Divisão de risco dos clubes</w:t>
-      </w:r>
-      <w:r>
-        <w:rPr>
-          <w:rFonts w:ascii="Arial" w:hAnsi="Arial" w:cs="Arial"/>
-          <w:color w:val="000000" w:themeColor="text1"/>
-          <w:sz w:val="24"/>
-        </w:rPr>
-        <w:t xml:space="preserve">: </w:t>
-      </w:r>
-      <w:r>
-        <w:rPr>
-          <w:rFonts w:ascii="Arial" w:hAnsi="Arial" w:cs="Arial"/>
-          <w:color w:val="000000" w:themeColor="text1"/>
-          <w:sz w:val="24"/>
-        </w:rPr>
-        <w:t>u</w:t>
-      </w:r>
-      <w:r>
-        <w:rPr>
-          <w:rFonts w:ascii="Arial" w:hAnsi="Arial" w:cs="Arial"/>
-          <w:color w:val="000000" w:themeColor="text1"/>
-          <w:sz w:val="24"/>
-        </w:rPr>
-        <w:t>ma formula para definir os clubes que possuem risco baixo, medio, alto e muito alto de rebaixamento de acordo com os resultados da temporada;</w:t>
+        <w:t xml:space="preserve">KPI 1 </w:t>
+      </w:r>
+      <w:r>
+        <w:rPr>
+          <w:rFonts w:ascii="Arial" w:hAnsi="Arial" w:cs="Arial"/>
+          <w:b/>
+          <w:bCs/>
+          <w:color w:val="000000" w:themeColor="text1"/>
+          <w:sz w:val="24"/>
+        </w:rPr>
+        <w:t xml:space="preserve">- </w:t>
+      </w:r>
+      <w:r>
+        <w:rPr>
+          <w:rFonts w:ascii="Arial" w:hAnsi="Arial" w:cs="Arial"/>
+          <w:b/>
+          <w:bCs/>
+          <w:color w:val="000000" w:themeColor="text1"/>
+          <w:sz w:val="24"/>
+        </w:rPr>
+        <w:t>Divisão de risco dos clubes</w:t>
+      </w:r>
+      <w:r>
+        <w:rPr>
+          <w:rFonts w:ascii="Arial" w:hAnsi="Arial" w:cs="Arial"/>
+          <w:color w:val="000000" w:themeColor="text1"/>
+          <w:sz w:val="24"/>
+        </w:rPr>
+        <w:t>:</w:t>
+      </w:r>
+      <w:r>
+        <w:t xml:space="preserve"> </w:t>
+      </w:r>
+      <w:r>
+        <w:rPr>
+          <w:rFonts w:ascii="Arial" w:hAnsi="Arial" w:cs="Arial"/>
+          <w:color w:val="000000" w:themeColor="text1"/>
+          <w:sz w:val="24"/>
+        </w:rPr>
+        <w:t xml:space="preserve">classifica os clubes </w:t>
+      </w:r>
+      <w:r>
+        <w:rPr>
+          <w:rFonts w:ascii="Arial" w:hAnsi="Arial" w:cs="Arial"/>
+          <w:color w:val="000000" w:themeColor="text1"/>
+          <w:sz w:val="24"/>
+        </w:rPr>
+        <w:t>conforme o</w:t>
+      </w:r>
+      <w:r>
+        <w:rPr>
+          <w:rFonts w:ascii="Arial" w:hAnsi="Arial" w:cs="Arial"/>
+          <w:color w:val="000000" w:themeColor="text1"/>
+          <w:sz w:val="24"/>
+        </w:rPr>
+        <w:t xml:space="preserve"> risco previsto de rebaixamento nas categorias Baixo, Médio, Alto e Muito alto</w:t>
+      </w:r>
+      <w:r>
+        <w:rPr>
+          <w:rFonts w:ascii="Arial" w:hAnsi="Arial" w:cs="Arial"/>
+          <w:color w:val="000000" w:themeColor="text1"/>
+          <w:sz w:val="24"/>
+        </w:rPr>
+        <w:t>;</w:t>
       </w:r>
     </w:p>
     <w:p>
@@ -351,7 +344,27 @@
           <w:color w:val="000000" w:themeColor="text1"/>
           <w:sz w:val="24"/>
         </w:rPr>
-        <w:t>KPI 2 Média de risco</w:t>
+        <w:t xml:space="preserve">KPI 2 </w:t>
+      </w:r>
+      <w:r>
+        <w:rPr>
+          <w:rFonts w:ascii="Arial" w:hAnsi="Arial" w:cs="Arial"/>
+          <w:b/>
+          <w:bCs/>
+          <w:color w:val="000000" w:themeColor="text1"/>
+          <w:sz w:val="24"/>
+        </w:rPr>
+        <w:t xml:space="preserve">- </w:t>
+      </w:r>
+      <w:r>
+        <w:rPr>
+          <w:rFonts w:ascii="Arial" w:hAnsi="Arial" w:cs="Arial"/>
+          <w:b/>
+          <w:bCs/>
+          <w:color w:val="000000" w:themeColor="text1"/>
+          <w:sz w:val="24"/>
+        </w:rPr>
+        <w:t>Média de risco</w:t>
       </w:r>
       <w:r>
         <w:rPr>
@@ -367,15 +380,15 @@
           <w:color w:val="000000" w:themeColor="text1"/>
           <w:sz w:val="24"/>
         </w:rPr>
-        <w:t>t</w:t>
-      </w:r>
-      <w:r>
-        <w:rPr>
-          <w:rFonts w:ascii="Arial" w:hAnsi="Arial" w:cs="Arial"/>
-          <w:color w:val="000000" w:themeColor="text1"/>
-          <w:sz w:val="24"/>
-        </w:rPr>
-        <w:t>raça e média de risco para rebaixamento na temporada, traçando por todos os clubes;</w:t>
+        <w:t>apresenta a média do risco previsto de rebaixamento entre os clubes analisados</w:t>
+      </w:r>
+      <w:r>
+        <w:rPr>
+          <w:rFonts w:ascii="Arial" w:hAnsi="Arial" w:cs="Arial"/>
+          <w:color w:val="000000" w:themeColor="text1"/>
+          <w:sz w:val="24"/>
+        </w:rPr>
+        <w:t>;</w:t>
       </w:r>
     </w:p>
     <w:p>
@@ -410,7 +423,27 @@
           <w:color w:val="000000" w:themeColor="text1"/>
           <w:sz w:val="24"/>
         </w:rPr>
-        <w:t>KPI 3 Maior risco de rebaixamento:</w:t>
+        <w:t xml:space="preserve">KPI 3 </w:t>
+      </w:r>
+      <w:r>
+        <w:rPr>
+          <w:rFonts w:ascii="Arial" w:hAnsi="Arial" w:cs="Arial"/>
+          <w:b/>
+          <w:bCs/>
+          <w:color w:val="000000" w:themeColor="text1"/>
+          <w:sz w:val="24"/>
+        </w:rPr>
+        <w:t xml:space="preserve">- </w:t>
+      </w:r>
+      <w:r>
+        <w:rPr>
+          <w:rFonts w:ascii="Arial" w:hAnsi="Arial" w:cs="Arial"/>
+          <w:b/>
+          <w:bCs/>
+          <w:color w:val="000000" w:themeColor="text1"/>
+          <w:sz w:val="24"/>
+        </w:rPr>
+        <w:t>Maior risco de rebaixamento:</w:t>
       </w:r>
       <w:r>
         <w:rPr>
@@ -426,15 +459,15 @@
           <w:color w:val="000000" w:themeColor="text1"/>
           <w:sz w:val="24"/>
         </w:rPr>
-        <w:t>trás</w:t>
-      </w:r>
-      <w:r>
-        <w:rPr>
-          <w:rFonts w:ascii="Arial" w:hAnsi="Arial" w:cs="Arial"/>
-          <w:color w:val="000000" w:themeColor="text1"/>
-          <w:sz w:val="24"/>
-        </w:rPr>
-        <w:t xml:space="preserve"> o nome e porcentagem de risco para rebaixamento do clube com maior risco;</w:t>
+        <w:t>identifica o clube que apresenta o maior risco previsto de rebaixamento na temporada analisada</w:t>
+      </w:r>
+      <w:r>
+        <w:rPr>
+          <w:rFonts w:ascii="Arial" w:hAnsi="Arial" w:cs="Arial"/>
+          <w:color w:val="000000" w:themeColor="text1"/>
+          <w:sz w:val="24"/>
+        </w:rPr>
+        <w:t>;</w:t>
       </w:r>
     </w:p>
     <w:p>
@@ -469,7 +502,27 @@
           <w:color w:val="000000" w:themeColor="text1"/>
           <w:sz w:val="24"/>
         </w:rPr>
-        <w:t>KPI 4 Menor risco de rebaixamento:</w:t>
+        <w:t xml:space="preserve">KPI 4 </w:t>
+      </w:r>
+      <w:r>
+        <w:rPr>
+          <w:rFonts w:ascii="Arial" w:hAnsi="Arial" w:cs="Arial"/>
+          <w:b/>
+          <w:bCs/>
+          <w:color w:val="000000" w:themeColor="text1"/>
+          <w:sz w:val="24"/>
+        </w:rPr>
+        <w:t xml:space="preserve">- </w:t>
+      </w:r>
+      <w:r>
+        <w:rPr>
+          <w:rFonts w:ascii="Arial" w:hAnsi="Arial" w:cs="Arial"/>
+          <w:b/>
+          <w:bCs/>
+          <w:color w:val="000000" w:themeColor="text1"/>
+          <w:sz w:val="24"/>
+        </w:rPr>
+        <w:t>Menor risco de rebaixamento:</w:t>
       </w:r>
       <w:r>
         <w:rPr>
@@ -485,15 +538,23 @@
           <w:color w:val="000000" w:themeColor="text1"/>
           <w:sz w:val="24"/>
         </w:rPr>
-        <w:t>inverso</w:t>
-      </w:r>
-      <w:r>
-        <w:rPr>
-          <w:rFonts w:ascii="Arial" w:hAnsi="Arial" w:cs="Arial"/>
-          <w:color w:val="000000" w:themeColor="text1"/>
-          <w:sz w:val="24"/>
-        </w:rPr>
-        <w:t xml:space="preserve"> do KPI 3, o clube com menor risco de rebaixamento;</w:t>
+        <w:t>identifica</w:t>
+      </w:r>
+      <w:r>
+        <w:rPr>
+          <w:rFonts w:ascii="Arial" w:hAnsi="Arial" w:cs="Arial"/>
+          <w:color w:val="000000" w:themeColor="text1"/>
+          <w:sz w:val="24"/>
+        </w:rPr>
+        <w:t xml:space="preserve"> o clube que apresenta o menor risco previsto de rebaixamento</w:t>
+      </w:r>
+      <w:r>
+        <w:rPr>
+          <w:rFonts w:ascii="Arial" w:hAnsi="Arial" w:cs="Arial"/>
+          <w:color w:val="000000" w:themeColor="text1"/>
+          <w:sz w:val="24"/>
+        </w:rPr>
+        <w:t>;</w:t>
       </w:r>
     </w:p>
     <w:p>
@@ -528,7 +589,27 @@
           <w:color w:val="000000" w:themeColor="text1"/>
           <w:sz w:val="24"/>
         </w:rPr>
-        <w:t>KPI 5 Risco de rebaixamento por clube</w:t>
+        <w:t xml:space="preserve">KPI 5 </w:t>
+      </w:r>
+      <w:r>
+        <w:rPr>
+          <w:rFonts w:ascii="Arial" w:hAnsi="Arial" w:cs="Arial"/>
+          <w:b/>
+          <w:bCs/>
+          <w:color w:val="000000" w:themeColor="text1"/>
+          <w:sz w:val="24"/>
+        </w:rPr>
+        <w:t xml:space="preserve">- </w:t>
+      </w:r>
+      <w:r>
+        <w:rPr>
+          <w:rFonts w:ascii="Arial" w:hAnsi="Arial" w:cs="Arial"/>
+          <w:b/>
+          <w:bCs/>
+          <w:color w:val="000000" w:themeColor="text1"/>
+          <w:sz w:val="24"/>
+        </w:rPr>
+        <w:t>Risco de rebaixamento por clube</w:t>
       </w:r>
       <w:r>
         <w:rPr>
@@ -546,31 +627,15 @@
           <w:color w:val="000000" w:themeColor="text1"/>
           <w:sz w:val="24"/>
         </w:rPr>
-        <w:t>gráfico</w:t>
-      </w:r>
-      <w:r>
-        <w:rPr>
-          <w:rFonts w:ascii="Arial" w:hAnsi="Arial" w:cs="Arial"/>
-          <w:color w:val="000000" w:themeColor="text1"/>
-          <w:sz w:val="24"/>
-        </w:rPr>
-        <w:t xml:space="preserve"> de barras mostrando a </w:t>
-      </w:r>
-      <w:r>
-        <w:rPr>
-          <w:rFonts w:ascii="Arial" w:hAnsi="Arial" w:cs="Arial"/>
-          <w:color w:val="000000" w:themeColor="text1"/>
-          <w:sz w:val="24"/>
-        </w:rPr>
-        <w:t>porcentagem</w:t>
-      </w:r>
-      <w:r>
-        <w:rPr>
-          <w:rFonts w:ascii="Arial" w:hAnsi="Arial" w:cs="Arial"/>
-          <w:color w:val="000000" w:themeColor="text1"/>
-          <w:sz w:val="24"/>
-        </w:rPr>
-        <w:t xml:space="preserve"> de cada clube teve na temporada de 2025 de ser rebaixado, sendo do maior ao menor risco.</w:t>
+        <w:t>apresenta, por meio de um gráfico de barras, o risco previsto de cada clube, permitindo comparar os clubes entre si</w:t>
+      </w:r>
+      <w:r>
+        <w:rPr>
+          <w:rFonts w:ascii="Arial" w:hAnsi="Arial" w:cs="Arial"/>
+          <w:color w:val="000000" w:themeColor="text1"/>
+          <w:sz w:val="24"/>
+        </w:rPr>
+        <w:t>;</w:t>
       </w:r>
     </w:p>
     <w:p>
@@ -605,8 +670,27 @@
           <w:color w:val="000000" w:themeColor="text1"/>
           <w:sz w:val="24"/>
         </w:rPr>
-        <w:lastRenderedPageBreak/>
-        <w:t xml:space="preserve">KPI 6 Risco de rebaixamento ao longo </w:t>
+        <w:t xml:space="preserve">KPI 6 </w:t>
+      </w:r>
+      <w:r>
+        <w:rPr>
+          <w:rFonts w:ascii="Arial" w:hAnsi="Arial" w:cs="Arial"/>
+          <w:b/>
+          <w:bCs/>
+          <w:color w:val="000000" w:themeColor="text1"/>
+          <w:sz w:val="24"/>
+        </w:rPr>
+        <w:t xml:space="preserve">- </w:t>
+      </w:r>
+      <w:r>
+        <w:rPr>
+          <w:rFonts w:ascii="Arial" w:hAnsi="Arial" w:cs="Arial"/>
+          <w:b/>
+          <w:bCs/>
+          <w:color w:val="000000" w:themeColor="text1"/>
+          <w:sz w:val="24"/>
+        </w:rPr>
+        <w:t xml:space="preserve">Risco de rebaixamento ao longo </w:t>
       </w:r>
       <w:r>
         <w:rPr>
@@ -634,23 +718,23 @@
           <w:color w:val="000000" w:themeColor="text1"/>
           <w:sz w:val="24"/>
         </w:rPr>
-        <w:t xml:space="preserve"> o gráfico mais importante </w:t>
-      </w:r>
-      <w:r>
-        <w:rPr>
-          <w:rFonts w:ascii="Arial" w:hAnsi="Arial" w:cs="Arial"/>
-          <w:color w:val="000000" w:themeColor="text1"/>
-          <w:sz w:val="24"/>
-        </w:rPr>
-        <w:t>até</w:t>
-      </w:r>
-      <w:r>
-        <w:rPr>
-          <w:rFonts w:ascii="Arial" w:hAnsi="Arial" w:cs="Arial"/>
-          <w:color w:val="000000" w:themeColor="text1"/>
-          <w:sz w:val="24"/>
-        </w:rPr>
-        <w:t xml:space="preserve"> aqui, trazendo como os clubes que tiveram maior risco da temporada de 2025 agiram nas temporadas passadas, desde 2014.</w:t>
+        <w:t xml:space="preserve"> </w:t>
+      </w:r>
+      <w:r>
+        <w:rPr>
+          <w:rFonts w:ascii="Arial" w:hAnsi="Arial" w:cs="Arial"/>
+          <w:color w:val="000000" w:themeColor="text1"/>
+          <w:sz w:val="24"/>
+        </w:rPr>
+        <w:t>apresenta a evolução histórica do risco previsto, permitindo observar como os clubes selecionados se comportaram ao longo das temporadas</w:t>
+      </w:r>
+      <w:r>
+        <w:rPr>
+          <w:rFonts w:ascii="Arial" w:hAnsi="Arial" w:cs="Arial"/>
+          <w:color w:val="000000" w:themeColor="text1"/>
+          <w:sz w:val="24"/>
+        </w:rPr>
+        <w:t>.</w:t>
       </w:r>
     </w:p>
     <w:p>
@@ -679,7 +763,64 @@
           <w:color w:val="000000" w:themeColor="text1"/>
           <w:sz w:val="24"/>
         </w:rPr>
-        <w:t>O KPI 6 é o gráfico mais importante do dashboard, sabendo como as temporadas passadas ocorreram, pode se presumir que o clube está no caminho certo ou no errado, ao exemplo de Internacional, que ao longo das temporadas teve um aumento de chance de rebaixamento crescendo consideravelmente, os restantes das KPIs tende a ser para auxiliar na análise, útil para procurar um clube para qual investir, por exemplo.</w:t>
+        <w:lastRenderedPageBreak/>
+        <w:t xml:space="preserve">O KPI 6 possui importância especial para a análise, pois permite comparar o risco previsto em diferentes temporadas e observar a evolução do desempenho dos clubes ao longo do tempo. Os demais indicadores complementam essa análise ao apresentar uma visão geral da distribuição dos riscos e destacar os clubes com maior e menor risco. As faixas de risco utilizadas no dashboard foram definidas a partir do valor previsto pelo modelo: risco </w:t>
+      </w:r>
+      <w:r>
+        <w:rPr>
+          <w:rFonts w:ascii="Arial" w:hAnsi="Arial" w:cs="Arial"/>
+          <w:color w:val="000000" w:themeColor="text1"/>
+          <w:sz w:val="24"/>
+        </w:rPr>
+        <w:t>b</w:t>
+      </w:r>
+      <w:r>
+        <w:rPr>
+          <w:rFonts w:ascii="Arial" w:hAnsi="Arial" w:cs="Arial"/>
+          <w:color w:val="000000" w:themeColor="text1"/>
+          <w:sz w:val="24"/>
+        </w:rPr>
+        <w:t>aixo para valores inferiores a 30%</w:t>
+      </w:r>
+      <w:r>
+        <w:rPr>
+          <w:rFonts w:ascii="Arial" w:hAnsi="Arial" w:cs="Arial"/>
+          <w:color w:val="000000" w:themeColor="text1"/>
+          <w:sz w:val="24"/>
+        </w:rPr>
+        <w:t>, médio</w:t>
+      </w:r>
+      <w:r>
+        <w:rPr>
+          <w:rFonts w:ascii="Arial" w:hAnsi="Arial" w:cs="Arial"/>
+          <w:color w:val="000000" w:themeColor="text1"/>
+          <w:sz w:val="24"/>
+        </w:rPr>
+        <w:t xml:space="preserve"> entre 30% e 49%</w:t>
+      </w:r>
+      <w:r>
+        <w:rPr>
+          <w:rFonts w:ascii="Arial" w:hAnsi="Arial" w:cs="Arial"/>
+          <w:color w:val="000000" w:themeColor="text1"/>
+          <w:sz w:val="24"/>
+        </w:rPr>
+        <w:t>, alto</w:t>
+      </w:r>
+      <w:r>
+        <w:rPr>
+          <w:rFonts w:ascii="Arial" w:hAnsi="Arial" w:cs="Arial"/>
+          <w:color w:val="000000" w:themeColor="text1"/>
+          <w:sz w:val="24"/>
+        </w:rPr>
+        <w:t xml:space="preserve"> entre 50% e 59% e Muito alto a partir de 60%</w:t>
+      </w:r>
+      <w:r>
+        <w:rPr>
+          <w:rFonts w:ascii="Arial" w:hAnsi="Arial" w:cs="Arial"/>
+          <w:color w:val="000000" w:themeColor="text1"/>
+          <w:sz w:val="24"/>
+        </w:rPr>
+        <w:t>.</w:t>
       </w:r>
     </w:p>
     <w:p>
@@ -807,10 +948,11 @@
     </w:p>
     <w:p>
       <w:pPr>
-        <w:spacing w:after="0" w:line="240" w:lineRule="auto"/>
-        <w:rPr>
-          <w:color w:val="000000" w:themeColor="text1"/>
-          <w:sz w:val="28"/>
+        <w:spacing w:after="0" w:line="360" w:lineRule="auto"/>
+        <w:rPr>
+          <w:rFonts w:ascii="Arial" w:hAnsi="Arial" w:cs="Arial"/>
+          <w:color w:val="000000" w:themeColor="text1"/>
+          <w:sz w:val="24"/>
           <w:szCs w:val="24"/>
         </w:rPr>
       </w:pPr>
@@ -823,68 +965,254 @@
       </w:r>
       <w:r>
         <w:rPr>
-          <w:color w:val="000000" w:themeColor="text1"/>
-          <w:sz w:val="28"/>
+          <w:rFonts w:ascii="Arial" w:hAnsi="Arial" w:cs="Arial"/>
+          <w:color w:val="000000" w:themeColor="text1"/>
+          <w:sz w:val="24"/>
           <w:szCs w:val="24"/>
         </w:rPr>
-        <w:t>A soluçao foi estruturada em etapas de preparação dos dados, modelagem preditiva e visualização dos resultados. Os dados utilizados no projeto foram incialmente analisados e preparados no Python, resultando em uma base analítica organizada em nível clube e temporada. Essa base foi utilizada como entrada para o notebook de modelagem preditiva na Fase 2.</w:t>
+        <w:t xml:space="preserve">A </w:t>
+      </w:r>
+      <w:r>
+        <w:rPr>
+          <w:rFonts w:ascii="Arial" w:hAnsi="Arial" w:cs="Arial"/>
+          <w:color w:val="000000" w:themeColor="text1"/>
+          <w:sz w:val="24"/>
+          <w:szCs w:val="24"/>
+        </w:rPr>
+        <w:t>solução</w:t>
+      </w:r>
+      <w:r>
+        <w:rPr>
+          <w:rFonts w:ascii="Arial" w:hAnsi="Arial" w:cs="Arial"/>
+          <w:color w:val="000000" w:themeColor="text1"/>
+          <w:sz w:val="24"/>
+          <w:szCs w:val="24"/>
+        </w:rPr>
+        <w:t xml:space="preserve"> foi estruturada em etapas de preparação dos dados, modelagem preditiva e visualização dos resultados. Os dados utilizados no projeto foram </w:t>
+      </w:r>
+      <w:r>
+        <w:rPr>
+          <w:rFonts w:ascii="Arial" w:hAnsi="Arial" w:cs="Arial"/>
+          <w:color w:val="000000" w:themeColor="text1"/>
+          <w:sz w:val="24"/>
+          <w:szCs w:val="24"/>
+        </w:rPr>
+        <w:t>inicialmente</w:t>
+      </w:r>
+      <w:r>
+        <w:rPr>
+          <w:rFonts w:ascii="Arial" w:hAnsi="Arial" w:cs="Arial"/>
+          <w:color w:val="000000" w:themeColor="text1"/>
+          <w:sz w:val="24"/>
+          <w:szCs w:val="24"/>
+        </w:rPr>
+        <w:t xml:space="preserve"> analisados e preparados no Python, resultando em uma base analítica organizada</w:t>
+      </w:r>
+      <w:r>
+        <w:rPr>
+          <w:rFonts w:ascii="Arial" w:hAnsi="Arial" w:cs="Arial"/>
+          <w:color w:val="000000" w:themeColor="text1"/>
+          <w:sz w:val="24"/>
+          <w:szCs w:val="24"/>
+        </w:rPr>
+        <w:t xml:space="preserve"> em nível</w:t>
+      </w:r>
+      <w:r>
+        <w:rPr>
+          <w:rFonts w:ascii="Arial" w:hAnsi="Arial" w:cs="Arial"/>
+          <w:color w:val="000000" w:themeColor="text1"/>
+          <w:sz w:val="24"/>
+          <w:szCs w:val="24"/>
+        </w:rPr>
+        <w:t xml:space="preserve"> clube e temporada. Essa base foi utilizada como entrada para o notebook de modelagem preditiva na Fase 2.</w:t>
       </w:r>
     </w:p>
     <w:p>
       <w:pPr>
-        <w:spacing w:after="0" w:line="240" w:lineRule="auto"/>
-        <w:rPr>
-          <w:color w:val="000000" w:themeColor="text1"/>
-          <w:sz w:val="28"/>
+        <w:spacing w:after="0" w:line="360" w:lineRule="auto"/>
+        <w:rPr>
+          <w:rFonts w:ascii="Arial" w:hAnsi="Arial" w:cs="Arial"/>
+          <w:color w:val="000000" w:themeColor="text1"/>
+          <w:sz w:val="24"/>
           <w:szCs w:val="24"/>
         </w:rPr>
       </w:pPr>
       <w:r>
         <w:rPr>
-          <w:color w:val="000000" w:themeColor="text1"/>
-          <w:sz w:val="28"/>
+          <w:rFonts w:ascii="Arial" w:hAnsi="Arial" w:cs="Arial"/>
+          <w:color w:val="000000" w:themeColor="text1"/>
+          <w:sz w:val="24"/>
           <w:szCs w:val="24"/>
         </w:rPr>
         <w:tab/>
-        <w:t>Na etapa de modelgaem, foi utilizda Regressão Logística para classificação do risco de rebaixamento. A avaliação foi realizada respeitando a ordem temporal de cada temporada, por meio de validação cruzada temporal com janela expansiva. Essa abordagem evita embaralhamento dos dados históricos e permite avaliar o modelo utilizando temporadas futuras em relaçao ao período utilizando para treinamento.</w:t>
+        <w:t xml:space="preserve">Na etapa de </w:t>
+      </w:r>
+      <w:r>
+        <w:rPr>
+          <w:rFonts w:ascii="Arial" w:hAnsi="Arial" w:cs="Arial"/>
+          <w:color w:val="000000" w:themeColor="text1"/>
+          <w:sz w:val="24"/>
+          <w:szCs w:val="24"/>
+        </w:rPr>
+        <w:t>modelagem</w:t>
+      </w:r>
+      <w:r>
+        <w:rPr>
+          <w:rFonts w:ascii="Arial" w:hAnsi="Arial" w:cs="Arial"/>
+          <w:color w:val="000000" w:themeColor="text1"/>
+          <w:sz w:val="24"/>
+          <w:szCs w:val="24"/>
+        </w:rPr>
+        <w:t xml:space="preserve">, foi </w:t>
+      </w:r>
+      <w:r>
+        <w:rPr>
+          <w:rFonts w:ascii="Arial" w:hAnsi="Arial" w:cs="Arial"/>
+          <w:color w:val="000000" w:themeColor="text1"/>
+          <w:sz w:val="24"/>
+          <w:szCs w:val="24"/>
+        </w:rPr>
+        <w:t>utilizada</w:t>
+      </w:r>
+      <w:r>
+        <w:rPr>
+          <w:rFonts w:ascii="Arial" w:hAnsi="Arial" w:cs="Arial"/>
+          <w:color w:val="000000" w:themeColor="text1"/>
+          <w:sz w:val="24"/>
+          <w:szCs w:val="24"/>
+        </w:rPr>
+        <w:t xml:space="preserve"> Regressão Logística para classificação do risco de rebaixamento. A avaliação foi realizada respeitando a ordem temporal de cada temporada, por meio de validação cruzada temporal com janela expansiva. Essa abordagem evita embaralhamento dos dados históricos e permite avaliar o modelo utilizando temporadas futuras em relaçao ao período utilizando para treinamento.</w:t>
       </w:r>
     </w:p>
     <w:p>
       <w:pPr>
-        <w:spacing w:after="0" w:line="240" w:lineRule="auto"/>
-        <w:rPr>
-          <w:color w:val="000000" w:themeColor="text1"/>
-          <w:sz w:val="28"/>
+        <w:spacing w:after="0" w:line="360" w:lineRule="auto"/>
+        <w:rPr>
+          <w:rFonts w:ascii="Arial" w:hAnsi="Arial" w:cs="Arial"/>
+          <w:color w:val="000000" w:themeColor="text1"/>
+          <w:sz w:val="24"/>
           <w:szCs w:val="24"/>
         </w:rPr>
       </w:pPr>
       <w:r>
         <w:rPr>
-          <w:color w:val="000000" w:themeColor="text1"/>
-          <w:sz w:val="28"/>
+          <w:rFonts w:ascii="Arial" w:hAnsi="Arial" w:cs="Arial"/>
+          <w:color w:val="000000" w:themeColor="text1"/>
+          <w:sz w:val="24"/>
           <w:szCs w:val="24"/>
         </w:rPr>
         <w:tab/>
-        <w:t>Após  a validação, foi construído o modelo utilizado para gerar as previsões temporais da temporada de 2025. O modelo final utiliza a posição final do clube na temporada como variável explicativa e gera uma probabilidade prevista de rebaixamento. Os resultados forma exportados para um arquivo CSV consolidado, contendo histocio eas previsoes, que posteriormente é utilizado como fonte de dados no Tableau.</w:t>
+        <w:t>Após</w:t>
+      </w:r>
+      <w:r>
+        <w:rPr>
+          <w:rFonts w:ascii="Arial" w:hAnsi="Arial" w:cs="Arial"/>
+          <w:color w:val="000000" w:themeColor="text1"/>
+          <w:sz w:val="24"/>
+          <w:szCs w:val="24"/>
+        </w:rPr>
+        <w:t xml:space="preserve"> </w:t>
+      </w:r>
+      <w:r>
+        <w:rPr>
+          <w:rFonts w:ascii="Arial" w:hAnsi="Arial" w:cs="Arial"/>
+          <w:color w:val="000000" w:themeColor="text1"/>
+          <w:sz w:val="24"/>
+          <w:szCs w:val="24"/>
+        </w:rPr>
+        <w:t xml:space="preserve">a validação, foi construído o modelo utilizado para gerar as previsões temporais da temporada de 2025. O modelo final utiliza a posição final do clube na temporada como variável explicativa e gera uma probabilidade prevista de rebaixamento. Os resultados forma exportados para um arquivo CSV consolidado, contendo </w:t>
+      </w:r>
+      <w:r>
+        <w:rPr>
+          <w:rFonts w:ascii="Arial" w:hAnsi="Arial" w:cs="Arial"/>
+          <w:color w:val="000000" w:themeColor="text1"/>
+          <w:sz w:val="24"/>
+          <w:szCs w:val="24"/>
+        </w:rPr>
+        <w:t>histórico</w:t>
+      </w:r>
+      <w:r>
+        <w:rPr>
+          <w:rFonts w:ascii="Arial" w:hAnsi="Arial" w:cs="Arial"/>
+          <w:color w:val="000000" w:themeColor="text1"/>
+          <w:sz w:val="24"/>
+          <w:szCs w:val="24"/>
+        </w:rPr>
+        <w:t xml:space="preserve"> e</w:t>
+      </w:r>
+      <w:r>
+        <w:rPr>
+          <w:rFonts w:ascii="Arial" w:hAnsi="Arial" w:cs="Arial"/>
+          <w:color w:val="000000" w:themeColor="text1"/>
+          <w:sz w:val="24"/>
+          <w:szCs w:val="24"/>
+        </w:rPr>
+        <w:t xml:space="preserve"> </w:t>
+      </w:r>
+      <w:r>
+        <w:rPr>
+          <w:rFonts w:ascii="Arial" w:hAnsi="Arial" w:cs="Arial"/>
+          <w:color w:val="000000" w:themeColor="text1"/>
+          <w:sz w:val="24"/>
+          <w:szCs w:val="24"/>
+        </w:rPr>
+        <w:t xml:space="preserve">as </w:t>
+      </w:r>
+      <w:r>
+        <w:rPr>
+          <w:rFonts w:ascii="Arial" w:hAnsi="Arial" w:cs="Arial"/>
+          <w:color w:val="000000" w:themeColor="text1"/>
+          <w:sz w:val="24"/>
+          <w:szCs w:val="24"/>
+        </w:rPr>
+        <w:t>previsões</w:t>
+      </w:r>
+      <w:r>
+        <w:rPr>
+          <w:rFonts w:ascii="Arial" w:hAnsi="Arial" w:cs="Arial"/>
+          <w:color w:val="000000" w:themeColor="text1"/>
+          <w:sz w:val="24"/>
+          <w:szCs w:val="24"/>
+        </w:rPr>
+        <w:t>, que posteriormente é utilizado como fonte de dados no Tableau.</w:t>
       </w:r>
     </w:p>
     <w:p>
       <w:pPr>
-        <w:spacing w:after="0" w:line="240" w:lineRule="auto"/>
-        <w:rPr>
-          <w:color w:val="000000" w:themeColor="text1"/>
-          <w:sz w:val="28"/>
+        <w:spacing w:after="0" w:line="360" w:lineRule="auto"/>
+        <w:rPr>
+          <w:rFonts w:ascii="Arial" w:hAnsi="Arial" w:cs="Arial"/>
+          <w:color w:val="000000" w:themeColor="text1"/>
+          <w:sz w:val="24"/>
           <w:szCs w:val="24"/>
         </w:rPr>
       </w:pPr>
       <w:r>
         <w:rPr>
-          <w:color w:val="000000" w:themeColor="text1"/>
-          <w:sz w:val="28"/>
+          <w:rFonts w:ascii="Arial" w:hAnsi="Arial" w:cs="Arial"/>
+          <w:color w:val="000000" w:themeColor="text1"/>
+          <w:sz w:val="24"/>
           <w:szCs w:val="24"/>
         </w:rPr>
         <w:tab/>
-        <w:t>Insrir uma imagem, aqui.</w:t>
+      </w:r>
+      <w:r>
+        <w:rPr>
+          <w:rFonts w:ascii="Arial" w:hAnsi="Arial" w:cs="Arial"/>
+          <w:color w:val="000000" w:themeColor="text1"/>
+          <w:sz w:val="24"/>
+          <w:szCs w:val="24"/>
+        </w:rPr>
+        <w:t>Inserir</w:t>
+      </w:r>
+      <w:r>
+        <w:rPr>
+          <w:rFonts w:ascii="Arial" w:hAnsi="Arial" w:cs="Arial"/>
+          <w:color w:val="000000" w:themeColor="text1"/>
+          <w:sz w:val="24"/>
+          <w:szCs w:val="24"/>
+        </w:rPr>
+        <w:t xml:space="preserve"> uma imagem, aqui.</w:t>
       </w:r>
     </w:p>
     <w:p>
@@ -900,42 +1228,70 @@
           <w:szCs w:val="23"/>
         </w:rPr>
       </w:pPr>
-      <w:r>
-        <w:rPr>
-          <w:rFonts w:asciiTheme="minorHAnsi" w:hAnsiTheme="minorHAnsi" w:cstheme="minorHAnsi"/>
-          <w:b/>
-          <w:bCs/>
-          <w:color w:val="4664BE"/>
-          <w:sz w:val="24"/>
-          <w:szCs w:val="23"/>
-        </w:rPr>
-        <w:t xml:space="preserve">3. </w:t>
-      </w:r>
-      <w:r>
-        <w:rPr>
-          <w:rFonts w:asciiTheme="minorHAnsi" w:hAnsiTheme="minorHAnsi" w:cstheme="minorHAnsi"/>
-          <w:b/>
-          <w:bCs/>
-          <w:color w:val="4664BE"/>
-          <w:sz w:val="24"/>
-          <w:szCs w:val="23"/>
-        </w:rPr>
-        <w:t>Solução de BI</w:t>
-      </w:r>
-      <w:r>
-        <w:rPr>
-          <w:rFonts w:asciiTheme="minorHAnsi" w:hAnsiTheme="minorHAnsi" w:cstheme="minorHAnsi"/>
-          <w:b/>
-          <w:bCs/>
-          <w:color w:val="4664BE"/>
-          <w:sz w:val="24"/>
-          <w:szCs w:val="23"/>
-        </w:rPr>
-        <w:t>:</w:t>
-      </w:r>
     </w:p>
     <w:p>
       <w:pPr>
+        <w:spacing w:before="720" w:after="0" w:line="240" w:lineRule="auto"/>
+        <w:jc w:val="both"/>
+        <w:rPr>
+          <w:rFonts w:asciiTheme="minorHAnsi" w:hAnsiTheme="minorHAnsi" w:cstheme="minorHAnsi"/>
+          <w:b/>
+          <w:bCs/>
+          <w:color w:val="4664BE"/>
+          <w:sz w:val="24"/>
+          <w:szCs w:val="23"/>
+        </w:rPr>
+      </w:pPr>
+    </w:p>
+    <w:p>
+      <w:pPr>
+        <w:spacing w:before="720" w:after="0" w:line="240" w:lineRule="auto"/>
+        <w:jc w:val="both"/>
+        <w:rPr>
+          <w:rFonts w:asciiTheme="minorHAnsi" w:hAnsiTheme="minorHAnsi" w:cstheme="minorHAnsi"/>
+          <w:b/>
+          <w:bCs/>
+          <w:color w:val="4664BE"/>
+          <w:sz w:val="24"/>
+          <w:szCs w:val="23"/>
+        </w:rPr>
+      </w:pPr>
+      <w:r>
+        <w:rPr>
+          <w:rFonts w:asciiTheme="minorHAnsi" w:hAnsiTheme="minorHAnsi" w:cstheme="minorHAnsi"/>
+          <w:b/>
+          <w:bCs/>
+          <w:color w:val="4664BE"/>
+          <w:sz w:val="24"/>
+          <w:szCs w:val="23"/>
+        </w:rPr>
+        <w:t xml:space="preserve">3. </w:t>
+      </w:r>
+      <w:r>
+        <w:rPr>
+          <w:rFonts w:asciiTheme="minorHAnsi" w:hAnsiTheme="minorHAnsi" w:cstheme="minorHAnsi"/>
+          <w:b/>
+          <w:bCs/>
+          <w:color w:val="4664BE"/>
+          <w:sz w:val="24"/>
+          <w:szCs w:val="23"/>
+        </w:rPr>
+        <w:t>Solução de BI</w:t>
+      </w:r>
+      <w:r>
+        <w:rPr>
+          <w:rFonts w:asciiTheme="minorHAnsi" w:hAnsiTheme="minorHAnsi" w:cstheme="minorHAnsi"/>
+          <w:b/>
+          <w:bCs/>
+          <w:color w:val="4664BE"/>
+          <w:sz w:val="24"/>
+          <w:szCs w:val="23"/>
+        </w:rPr>
+        <w:t>:</w:t>
+      </w:r>
+    </w:p>
+    <w:p>
+      <w:pPr>
         <w:spacing w:after="0" w:line="240" w:lineRule="auto"/>
         <w:jc w:val="both"/>
         <w:rPr>
@@ -952,7 +1308,6 @@
           <w:color w:val="7B7B7B" w:themeColor="accent3" w:themeShade="BF"/>
           <w:szCs w:val="21"/>
         </w:rPr>
-        <w:lastRenderedPageBreak/>
         <w:t>Descreva a solução implementada. Link para o código fonte, dicionário de dados, dashboards e análises realizadas.</w:t>
       </w:r>
       <w:r>
@@ -1103,18 +1458,91 @@
     </w:p>
     <w:p>
       <w:pPr>
-        <w:spacing w:after="0" w:line="240" w:lineRule="auto"/>
-        <w:rPr>
-          <w:color w:val="000000" w:themeColor="text1"/>
-          <w:sz w:val="24"/>
-        </w:rPr>
-      </w:pPr>
-      <w:r>
-        <w:rPr>
-          <w:color w:val="000000" w:themeColor="text1"/>
-          <w:sz w:val="24"/>
-        </w:rPr>
-        <w:t>Insira aqui o link.</w:t>
+        <w:spacing w:after="0" w:line="360" w:lineRule="auto"/>
+        <w:rPr>
+          <w:rFonts w:ascii="Arial" w:hAnsi="Arial" w:cs="Arial"/>
+          <w:color w:val="000000" w:themeColor="text1"/>
+          <w:sz w:val="24"/>
+          <w:szCs w:val="24"/>
+        </w:rPr>
+      </w:pPr>
+      <w:r>
+        <w:rPr>
+          <w:color w:val="000000" w:themeColor="text1"/>
+          <w:sz w:val="24"/>
+        </w:rPr>
+        <w:tab/>
+      </w:r>
+      <w:r>
+        <w:rPr>
+          <w:rFonts w:ascii="Arial" w:hAnsi="Arial" w:cs="Arial"/>
+          <w:color w:val="000000" w:themeColor="text1"/>
+          <w:sz w:val="24"/>
+          <w:szCs w:val="24"/>
+        </w:rPr>
+        <w:t xml:space="preserve">A solução de BI desenvolvida tem como objetivo transformar as previsões produzidas pelo modelo de classificação em informações visuais para análise do risco de rebaixamento dos clubes. O processo inicia-se com a base analítica clube-temporada, que contém informações de desempenho como vitórias, empates, derrotas, gols marcados, gols sofridos, pontos, saldo de gols e posição. A partir dessa base é realizada a modelagem preditiva utilizando Regressão Logística. O modelo foi avaliado por validação cruzada temporal, utilizando as temporadas anteriores para realizar previsões sobre temporadas posteriores. </w:t>
+      </w:r>
+    </w:p>
+    <w:p>
+      <w:pPr>
+        <w:spacing w:after="0" w:line="360" w:lineRule="auto"/>
+        <w:ind w:firstLine="708"/>
+        <w:rPr>
+          <w:rFonts w:ascii="Arial" w:hAnsi="Arial" w:cs="Arial"/>
+          <w:color w:val="000000" w:themeColor="text1"/>
+          <w:sz w:val="24"/>
+          <w:szCs w:val="24"/>
+        </w:rPr>
+      </w:pPr>
+      <w:r>
+        <w:rPr>
+          <w:rFonts w:ascii="Arial" w:hAnsi="Arial" w:cs="Arial"/>
+          <w:color w:val="000000" w:themeColor="text1"/>
+          <w:sz w:val="24"/>
+          <w:szCs w:val="24"/>
+        </w:rPr>
+        <w:t xml:space="preserve">Na avaliação agregada das previsões, o modelo com balanceamento das classes apresentou precisão de 0,26, recall de 0,77 e F1 de 0,39. O recall foi priorizado devido ao objetivo de utilizar o modelo como mecanismo de alerta de risco. Para a geração da previsão de 2025, o modelo final foi treinado com o histórico disponível entre 2006 e 2024. A variável utilizada no modelo final foi a posição final do clube na temporada. </w:t>
+      </w:r>
+    </w:p>
+    <w:p>
+      <w:pPr>
+        <w:spacing w:after="0" w:line="360" w:lineRule="auto"/>
+        <w:ind w:firstLine="708"/>
+        <w:rPr>
+          <w:rFonts w:ascii="Arial" w:hAnsi="Arial" w:cs="Arial"/>
+          <w:color w:val="000000" w:themeColor="text1"/>
+          <w:sz w:val="24"/>
+          <w:szCs w:val="24"/>
+        </w:rPr>
+      </w:pPr>
+      <w:r>
+        <w:rPr>
+          <w:rFonts w:ascii="Arial" w:hAnsi="Arial" w:cs="Arial"/>
+          <w:color w:val="000000" w:themeColor="text1"/>
+          <w:sz w:val="24"/>
+          <w:szCs w:val="24"/>
+        </w:rPr>
+        <w:t xml:space="preserve">A partir dela foi calculada a probabilidade prevista de rebaixamento para os clubes da temporada de 2025. O resultado da modelagem foi exportado para o arquivo </w:t>
+      </w:r>
+      <w:r>
+        <w:rPr>
+          <w:rFonts w:ascii="Arial" w:hAnsi="Arial" w:cs="Arial"/>
+          <w:i/>
+          <w:iCs/>
+          <w:color w:val="000000" w:themeColor="text1"/>
+          <w:sz w:val="24"/>
+          <w:szCs w:val="24"/>
+        </w:rPr>
+        <w:t>dashboard_tableu.csv</w:t>
+      </w:r>
+      <w:r>
+        <w:rPr>
+          <w:rFonts w:ascii="Arial" w:hAnsi="Arial" w:cs="Arial"/>
+          <w:color w:val="000000" w:themeColor="text1"/>
+          <w:sz w:val="24"/>
+          <w:szCs w:val="24"/>
+        </w:rPr>
+        <w:t>, que contém os dados históricos e as previsões utilizadas no Tableau. No Tableau, os resultados são apresentados por meio de indicadores e gráficos que permitem identificar a distribuição do risco, os clubes com maior e menor risco e a evolução histórica das previsões.</w:t>
       </w:r>
     </w:p>
     <w:sectPr>
@@ -3600,19 +4028,14 @@
 </file>
 
 <file path=customXml/item1.xml><?xml version="1.0" encoding="utf-8"?>
-<b:Sources xmlns:b="http://schemas.openxmlformats.org/officeDocument/2006/bibliography" xmlns="http://schemas.openxmlformats.org/officeDocument/2006/bibliography" SelectedStyle="\APASixthEditionOfficeOnline.xsl" StyleName="APA" Version="6"/>
+<p:properties xmlns:p="http://schemas.microsoft.com/office/2006/metadata/properties" xmlns:xsi="http://www.w3.org/2001/XMLSchema-instance" xmlns:pc="http://schemas.microsoft.com/office/infopath/2007/PartnerControls">
+  <documentManagement>
+    <_activity xmlns="73bd2b1f-886a-4f1d-b0bb-23f49d491aa9" xsi:nil="true"/>
+  </documentManagement>
+</p:properties>
 </file>
 
 <file path=customXml/item2.xml><?xml version="1.0" encoding="utf-8"?>
-<?mso-contentType ?>
-<FormTemplates xmlns="http://schemas.microsoft.com/sharepoint/v3/contenttype/forms">
-  <Display>DocumentLibraryForm</Display>
-  <Edit>DocumentLibraryForm</Edit>
-  <New>DocumentLibraryForm</New>
-</FormTemplates>
-</file>
-
-<file path=customXml/item3.xml><?xml version="1.0" encoding="utf-8"?>
 <ct:contentTypeSchema xmlns:ct="http://schemas.microsoft.com/office/2006/metadata/contentType" xmlns:ma="http://schemas.microsoft.com/office/2006/metadata/properties/metaAttributes" ct:_="" ma:_="" ma:contentTypeName="Documento" ma:contentTypeID="0x010100B048A1A6D184364FB502BBB6EBF2C3D9" ma:contentTypeVersion="14" ma:contentTypeDescription="Crie um novo documento." ma:contentTypeScope="" ma:versionID="d7146710810563b9c6e4c1a91b60f5f9">
   <xsd:schema xmlns:xsd="http://www.w3.org/2001/XMLSchema" xmlns:xs="http://www.w3.org/2001/XMLSchema" xmlns:p="http://schemas.microsoft.com/office/2006/metadata/properties" xmlns:ns3="73bd2b1f-886a-4f1d-b0bb-23f49d491aa9" xmlns:ns4="85818a3c-b8e7-4f75-b80a-610982c277d3" targetNamespace="http://schemas.microsoft.com/office/2006/metadata/properties" ma:root="true" ma:fieldsID="8b8875638ef7369d6012dd60a980de1b" ns3:_="" ns4:_="">
     <xsd:import namespace="73bd2b1f-886a-4f1d-b0bb-23f49d491aa9"/>
@@ -3841,31 +4264,30 @@
 </ct:contentTypeSchema>
 </file>
 
+<file path=customXml/item3.xml><?xml version="1.0" encoding="utf-8"?>
+<?mso-contentType ?>
+<FormTemplates xmlns="http://schemas.microsoft.com/sharepoint/v3/contenttype/forms">
+  <Display>DocumentLibraryForm</Display>
+  <Edit>DocumentLibraryForm</Edit>
+  <New>DocumentLibraryForm</New>
+</FormTemplates>
+</file>
+
 <file path=customXml/item4.xml><?xml version="1.0" encoding="utf-8"?>
-<p:properties xmlns:p="http://schemas.microsoft.com/office/2006/metadata/properties" xmlns:xsi="http://www.w3.org/2001/XMLSchema-instance" xmlns:pc="http://schemas.microsoft.com/office/infopath/2007/PartnerControls">
-  <documentManagement>
-    <_activity xmlns="73bd2b1f-886a-4f1d-b0bb-23f49d491aa9" xsi:nil="true"/>
-  </documentManagement>
-</p:properties>
+<b:Sources xmlns:b="http://schemas.openxmlformats.org/officeDocument/2006/bibliography" xmlns="http://schemas.openxmlformats.org/officeDocument/2006/bibliography" SelectedStyle="\APASixthEditionOfficeOnline.xsl" StyleName="APA" Version="6"/>
 </file>
 
 <file path=customXml/itemProps1.xml><?xml version="1.0" encoding="utf-8"?>
-<ds:datastoreItem xmlns:ds="http://schemas.openxmlformats.org/officeDocument/2006/customXml" ds:itemID="{F61111CE-2DDF-46E8-9D66-B3D8C921A39E}">
+<ds:datastoreItem xmlns:ds="http://schemas.openxmlformats.org/officeDocument/2006/customXml" ds:itemID="{10811A0B-354D-477E-AF27-C929DD9532C2}">
   <ds:schemaRefs>
-    <ds:schemaRef ds:uri="http://schemas.openxmlformats.org/officeDocument/2006/bibliography"/>
+    <ds:schemaRef ds:uri="http://schemas.microsoft.com/office/2006/metadata/properties"/>
+    <ds:schemaRef ds:uri="http://schemas.microsoft.com/office/infopath/2007/PartnerControls"/>
+    <ds:schemaRef ds:uri="73bd2b1f-886a-4f1d-b0bb-23f49d491aa9"/>
   </ds:schemaRefs>
 </ds:datastoreItem>
 </file>
 
 <file path=customXml/itemProps2.xml><?xml version="1.0" encoding="utf-8"?>
-<ds:datastoreItem xmlns:ds="http://schemas.openxmlformats.org/officeDocument/2006/customXml" ds:itemID="{0593B9FC-456C-46BA-ABE7-4E86A6CE6864}">
-  <ds:schemaRefs>
-    <ds:schemaRef ds:uri="http://schemas.microsoft.com/sharepoint/v3/contenttype/forms"/>
-  </ds:schemaRefs>
-</ds:datastoreItem>
-</file>
-
-<file path=customXml/itemProps3.xml><?xml version="1.0" encoding="utf-8"?>
 <ds:datastoreItem xmlns:ds="http://schemas.openxmlformats.org/officeDocument/2006/customXml" ds:itemID="{D06ADA8E-DF43-49D2-A0A1-50B9B3A2B035}">
   <ds:schemaRefs>
     <ds:schemaRef ds:uri="http://schemas.microsoft.com/office/2006/metadata/contentType"/>
@@ -3884,12 +4306,18 @@
 </ds:datastoreItem>
 </file>
 
+<file path=customXml/itemProps3.xml><?xml version="1.0" encoding="utf-8"?>
+<ds:datastoreItem xmlns:ds="http://schemas.openxmlformats.org/officeDocument/2006/customXml" ds:itemID="{0593B9FC-456C-46BA-ABE7-4E86A6CE6864}">
+  <ds:schemaRefs>
+    <ds:schemaRef ds:uri="http://schemas.microsoft.com/sharepoint/v3/contenttype/forms"/>
+  </ds:schemaRefs>
+</ds:datastoreItem>
+</file>
+
 <file path=customXml/itemProps4.xml><?xml version="1.0" encoding="utf-8"?>
-<ds:datastoreItem xmlns:ds="http://schemas.openxmlformats.org/officeDocument/2006/customXml" ds:itemID="{10811A0B-354D-477E-AF27-C929DD9532C2}">
+<ds:datastoreItem xmlns:ds="http://schemas.openxmlformats.org/officeDocument/2006/customXml" ds:itemID="{F61111CE-2DDF-46E8-9D66-B3D8C921A39E}">
   <ds:schemaRefs>
-    <ds:schemaRef ds:uri="http://schemas.microsoft.com/office/2006/metadata/properties"/>
-    <ds:schemaRef ds:uri="http://schemas.microsoft.com/office/infopath/2007/PartnerControls"/>
-    <ds:schemaRef ds:uri="73bd2b1f-886a-4f1d-b0bb-23f49d491aa9"/>
+    <ds:schemaRef ds:uri="http://schemas.openxmlformats.org/officeDocument/2006/bibliography"/>
   </ds:schemaRefs>
 </ds:datastoreItem>
 </file>
</xml_diff>

<commit_message>
feat: Melhoria de textos e links incluidos
</commit_message>
<xml_diff>
--- a/docs/Template - Fase 2 - Projeto em Business Intelligence e Analytics.docx
+++ b/docs/Template - Fase 2 - Projeto em Business Intelligence e Analytics.docx
@@ -1543,6 +1543,429 @@
           <w:szCs w:val="24"/>
         </w:rPr>
         <w:t>, que contém os dados históricos e as previsões utilizadas no Tableau. No Tableau, os resultados são apresentados por meio de indicadores e gráficos que permitem identificar a distribuição do risco, os clubes com maior e menor risco e a evolução histórica das previsões.</w:t>
+      </w:r>
+    </w:p>
+    <w:p>
+      <w:pPr>
+        <w:spacing w:after="0" w:line="360" w:lineRule="auto"/>
+        <w:ind w:firstLine="708"/>
+        <w:rPr>
+          <w:rFonts w:ascii="Arial" w:hAnsi="Arial" w:cs="Arial"/>
+          <w:color w:val="000000" w:themeColor="text1"/>
+          <w:sz w:val="24"/>
+          <w:szCs w:val="24"/>
+        </w:rPr>
+      </w:pPr>
+      <w:r>
+        <w:rPr>
+          <w:rFonts w:ascii="Arial" w:hAnsi="Arial" w:cs="Arial"/>
+          <w:color w:val="000000" w:themeColor="text1"/>
+          <w:sz w:val="24"/>
+          <w:szCs w:val="24"/>
+        </w:rPr>
+        <w:t xml:space="preserve">A solução implementada contém: </w:t>
+      </w:r>
+    </w:p>
+    <w:p>
+      <w:pPr>
+        <w:spacing w:after="0" w:line="360" w:lineRule="auto"/>
+        <w:ind w:firstLine="708"/>
+        <w:rPr>
+          <w:rFonts w:ascii="Arial" w:hAnsi="Arial" w:cs="Arial"/>
+          <w:color w:val="000000" w:themeColor="text1"/>
+          <w:sz w:val="24"/>
+          <w:szCs w:val="24"/>
+        </w:rPr>
+      </w:pPr>
+      <w:r>
+        <w:rPr>
+          <w:rFonts w:ascii="Arial" w:hAnsi="Arial" w:cs="Arial"/>
+          <w:color w:val="000000" w:themeColor="text1"/>
+          <w:sz w:val="24"/>
+          <w:szCs w:val="24"/>
+        </w:rPr>
+        <w:t xml:space="preserve">• Classificação dos clubes por faixa de risco; </w:t>
+      </w:r>
+    </w:p>
+    <w:p>
+      <w:pPr>
+        <w:spacing w:after="0" w:line="360" w:lineRule="auto"/>
+        <w:ind w:firstLine="708"/>
+        <w:rPr>
+          <w:rFonts w:ascii="Arial" w:hAnsi="Arial" w:cs="Arial"/>
+          <w:color w:val="000000" w:themeColor="text1"/>
+          <w:sz w:val="24"/>
+          <w:szCs w:val="24"/>
+        </w:rPr>
+      </w:pPr>
+      <w:r>
+        <w:rPr>
+          <w:rFonts w:ascii="Arial" w:hAnsi="Arial" w:cs="Arial"/>
+          <w:color w:val="000000" w:themeColor="text1"/>
+          <w:sz w:val="24"/>
+          <w:szCs w:val="24"/>
+        </w:rPr>
+        <w:t xml:space="preserve">• Média do risco de rebaixamento; </w:t>
+      </w:r>
+    </w:p>
+    <w:p>
+      <w:pPr>
+        <w:spacing w:after="0" w:line="360" w:lineRule="auto"/>
+        <w:ind w:firstLine="708"/>
+        <w:rPr>
+          <w:rFonts w:ascii="Arial" w:hAnsi="Arial" w:cs="Arial"/>
+          <w:color w:val="000000" w:themeColor="text1"/>
+          <w:sz w:val="24"/>
+          <w:szCs w:val="24"/>
+        </w:rPr>
+      </w:pPr>
+      <w:r>
+        <w:rPr>
+          <w:rFonts w:ascii="Arial" w:hAnsi="Arial" w:cs="Arial"/>
+          <w:color w:val="000000" w:themeColor="text1"/>
+          <w:sz w:val="24"/>
+          <w:szCs w:val="24"/>
+        </w:rPr>
+        <w:t xml:space="preserve">• Identificação do maior risco; </w:t>
+      </w:r>
+    </w:p>
+    <w:p>
+      <w:pPr>
+        <w:spacing w:after="0" w:line="360" w:lineRule="auto"/>
+        <w:ind w:firstLine="708"/>
+        <w:rPr>
+          <w:rFonts w:ascii="Arial" w:hAnsi="Arial" w:cs="Arial"/>
+          <w:color w:val="000000" w:themeColor="text1"/>
+          <w:sz w:val="24"/>
+          <w:szCs w:val="24"/>
+        </w:rPr>
+      </w:pPr>
+      <w:r>
+        <w:rPr>
+          <w:rFonts w:ascii="Arial" w:hAnsi="Arial" w:cs="Arial"/>
+          <w:color w:val="000000" w:themeColor="text1"/>
+          <w:sz w:val="24"/>
+          <w:szCs w:val="24"/>
+        </w:rPr>
+        <w:t xml:space="preserve">• Identificação do menor risco; </w:t>
+      </w:r>
+    </w:p>
+    <w:p>
+      <w:pPr>
+        <w:spacing w:after="0" w:line="360" w:lineRule="auto"/>
+        <w:ind w:firstLine="708"/>
+        <w:rPr>
+          <w:rFonts w:ascii="Arial" w:hAnsi="Arial" w:cs="Arial"/>
+          <w:color w:val="000000" w:themeColor="text1"/>
+          <w:sz w:val="24"/>
+          <w:szCs w:val="24"/>
+        </w:rPr>
+      </w:pPr>
+      <w:r>
+        <w:rPr>
+          <w:rFonts w:ascii="Arial" w:hAnsi="Arial" w:cs="Arial"/>
+          <w:color w:val="000000" w:themeColor="text1"/>
+          <w:sz w:val="24"/>
+          <w:szCs w:val="24"/>
+        </w:rPr>
+        <w:lastRenderedPageBreak/>
+        <w:t xml:space="preserve">• Gráfico de risco previsto por clube; </w:t>
+      </w:r>
+    </w:p>
+    <w:p>
+      <w:pPr>
+        <w:spacing w:after="0" w:line="360" w:lineRule="auto"/>
+        <w:ind w:firstLine="708"/>
+        <w:rPr>
+          <w:rFonts w:ascii="Arial" w:hAnsi="Arial" w:cs="Arial"/>
+          <w:color w:val="000000" w:themeColor="text1"/>
+          <w:sz w:val="24"/>
+          <w:szCs w:val="24"/>
+        </w:rPr>
+      </w:pPr>
+      <w:r>
+        <w:rPr>
+          <w:rFonts w:ascii="Arial" w:hAnsi="Arial" w:cs="Arial"/>
+          <w:color w:val="000000" w:themeColor="text1"/>
+          <w:sz w:val="24"/>
+          <w:szCs w:val="24"/>
+        </w:rPr>
+        <w:t>• Gráfico de evolução do risco ao longo das temporadas.</w:t>
+      </w:r>
+    </w:p>
+    <w:p>
+      <w:pPr>
+        <w:spacing w:after="0" w:line="360" w:lineRule="auto"/>
+        <w:ind w:firstLine="708"/>
+        <w:rPr>
+          <w:rFonts w:ascii="Arial" w:hAnsi="Arial" w:cs="Arial"/>
+          <w:color w:val="000000" w:themeColor="text1"/>
+          <w:sz w:val="24"/>
+          <w:szCs w:val="24"/>
+        </w:rPr>
+      </w:pPr>
+    </w:p>
+    <w:p>
+      <w:pPr>
+        <w:spacing w:after="0" w:line="360" w:lineRule="auto"/>
+        <w:ind w:firstLine="708"/>
+        <w:rPr>
+          <w:rFonts w:ascii="Arial" w:hAnsi="Arial" w:cs="Arial"/>
+          <w:color w:val="000000" w:themeColor="text1"/>
+          <w:sz w:val="24"/>
+          <w:szCs w:val="24"/>
+        </w:rPr>
+      </w:pPr>
+      <w:r>
+        <w:rPr>
+          <w:rFonts w:ascii="Arial" w:hAnsi="Arial" w:cs="Arial"/>
+          <w:color w:val="000000" w:themeColor="text1"/>
+          <w:sz w:val="24"/>
+          <w:szCs w:val="24"/>
+        </w:rPr>
+        <w:t xml:space="preserve"> O dashboard permite, dessa forma, transformar a saída do modelo preditivo em uma ferramenta visual de apoio à análise. A solução não tem como objetivo substituir a avaliação esportiva dos clubes, mas fornecer uma indicação quantitativa baseada nos dados históricos e no modelo desenvolvido. O código-fonte, os notebooks, os dados processados e a documentação do projeto estão disponíveis no repositório GitHub. O dashboard foi desenvolvido no Tableau utilizando como fonte o arquivo consolidado de resultados produzido pela etapa de modelagem.</w:t>
+      </w:r>
+    </w:p>
+    <w:p>
+      <w:pPr>
+        <w:spacing w:after="0" w:line="360" w:lineRule="auto"/>
+        <w:ind w:firstLine="708"/>
+        <w:rPr>
+          <w:rFonts w:ascii="Arial" w:hAnsi="Arial" w:cs="Arial"/>
+          <w:color w:val="000000" w:themeColor="text1"/>
+          <w:sz w:val="24"/>
+          <w:szCs w:val="24"/>
+        </w:rPr>
+      </w:pPr>
+    </w:p>
+    <w:p>
+      <w:pPr>
+        <w:spacing w:after="0" w:line="360" w:lineRule="auto"/>
+        <w:rPr>
+          <w:rFonts w:ascii="Arial" w:hAnsi="Arial" w:cs="Arial"/>
+          <w:color w:val="000000" w:themeColor="text1"/>
+          <w:sz w:val="24"/>
+          <w:szCs w:val="24"/>
+        </w:rPr>
+      </w:pPr>
+      <w:r>
+        <w:rPr>
+          <w:rFonts w:ascii="Arial" w:hAnsi="Arial" w:cs="Arial"/>
+          <w:color w:val="000000" w:themeColor="text1"/>
+          <w:sz w:val="24"/>
+          <w:szCs w:val="24"/>
+        </w:rPr>
+        <w:t>Acesso ao repositório do projeto:</w:t>
+      </w:r>
+    </w:p>
+    <w:p>
+      <w:pPr>
+        <w:spacing w:after="0" w:line="360" w:lineRule="auto"/>
+        <w:rPr>
+          <w:rFonts w:ascii="Arial" w:hAnsi="Arial" w:cs="Arial"/>
+          <w:color w:val="000000" w:themeColor="text1"/>
+          <w:sz w:val="24"/>
+          <w:szCs w:val="24"/>
+        </w:rPr>
+      </w:pPr>
+    </w:p>
+    <w:p>
+      <w:pPr>
+        <w:spacing w:after="0" w:line="360" w:lineRule="auto"/>
+        <w:rPr>
+          <w:rFonts w:ascii="Arial" w:hAnsi="Arial" w:cs="Arial"/>
+          <w:color w:val="000000" w:themeColor="text1"/>
+          <w:sz w:val="24"/>
+          <w:szCs w:val="24"/>
+        </w:rPr>
+      </w:pPr>
+      <w:r>
+        <w:rPr>
+          <w:rFonts w:ascii="Arial" w:hAnsi="Arial" w:cs="Arial"/>
+          <w:color w:val="000000" w:themeColor="text1"/>
+          <w:sz w:val="24"/>
+          <w:szCs w:val="24"/>
+        </w:rPr>
+        <w:t>GITHUB. Projeto em Business Intelligence e Analytics. Disponível em:</w:t>
+      </w:r>
+    </w:p>
+    <w:p>
+      <w:pPr>
+        <w:spacing w:after="0" w:line="360" w:lineRule="auto"/>
+        <w:rPr>
+          <w:rFonts w:ascii="Arial" w:hAnsi="Arial" w:cs="Arial"/>
+          <w:color w:val="000000" w:themeColor="text1"/>
+          <w:sz w:val="24"/>
+          <w:szCs w:val="24"/>
+        </w:rPr>
+      </w:pPr>
+      <w:r>
+        <w:rPr>
+          <w:rFonts w:ascii="Arial" w:hAnsi="Arial" w:cs="Arial"/>
+          <w:color w:val="000000" w:themeColor="text1"/>
+          <w:sz w:val="24"/>
+          <w:szCs w:val="24"/>
+        </w:rPr>
+        <w:t>https://github.com/FelipePinheiro964/Projeto-Em-Business-Intelligence-e-Analytics.</w:t>
+      </w:r>
+    </w:p>
+    <w:p>
+      <w:pPr>
+        <w:spacing w:after="0" w:line="360" w:lineRule="auto"/>
+        <w:rPr>
+          <w:rFonts w:ascii="Arial" w:hAnsi="Arial" w:cs="Arial"/>
+          <w:color w:val="000000" w:themeColor="text1"/>
+          <w:sz w:val="24"/>
+          <w:szCs w:val="24"/>
+        </w:rPr>
+      </w:pPr>
+      <w:r>
+        <w:rPr>
+          <w:rFonts w:ascii="Arial" w:hAnsi="Arial" w:cs="Arial"/>
+          <w:color w:val="000000" w:themeColor="text1"/>
+          <w:sz w:val="24"/>
+          <w:szCs w:val="24"/>
+        </w:rPr>
+        <w:t xml:space="preserve">Acesso em: </w:t>
+      </w:r>
+      <w:r>
+        <w:rPr>
+          <w:rFonts w:ascii="Arial" w:hAnsi="Arial" w:cs="Arial"/>
+          <w:color w:val="000000" w:themeColor="text1"/>
+          <w:sz w:val="24"/>
+          <w:szCs w:val="24"/>
+        </w:rPr>
+        <w:t>**</w:t>
+      </w:r>
+      <w:r>
+        <w:rPr>
+          <w:rFonts w:ascii="Arial" w:hAnsi="Arial" w:cs="Arial"/>
+          <w:color w:val="000000" w:themeColor="text1"/>
+          <w:sz w:val="24"/>
+          <w:szCs w:val="24"/>
+        </w:rPr>
+        <w:t xml:space="preserve"> ago. 2026.</w:t>
+      </w:r>
+    </w:p>
+    <w:p>
+      <w:pPr>
+        <w:spacing w:after="0" w:line="360" w:lineRule="auto"/>
+        <w:rPr>
+          <w:rFonts w:ascii="Arial" w:hAnsi="Arial" w:cs="Arial"/>
+          <w:color w:val="000000" w:themeColor="text1"/>
+          <w:sz w:val="24"/>
+          <w:szCs w:val="24"/>
+        </w:rPr>
+      </w:pPr>
+    </w:p>
+    <w:p>
+      <w:pPr>
+        <w:spacing w:after="0" w:line="360" w:lineRule="auto"/>
+        <w:rPr>
+          <w:rFonts w:ascii="Arial" w:hAnsi="Arial" w:cs="Arial"/>
+          <w:color w:val="000000" w:themeColor="text1"/>
+          <w:sz w:val="24"/>
+          <w:szCs w:val="24"/>
+        </w:rPr>
+      </w:pPr>
+      <w:r>
+        <w:rPr>
+          <w:rFonts w:ascii="Arial" w:hAnsi="Arial" w:cs="Arial"/>
+          <w:color w:val="000000" w:themeColor="text1"/>
+          <w:sz w:val="24"/>
+          <w:szCs w:val="24"/>
+        </w:rPr>
+        <w:t>Acesso ao dashboard:</w:t>
+      </w:r>
+    </w:p>
+    <w:p>
+      <w:pPr>
+        <w:spacing w:after="0" w:line="360" w:lineRule="auto"/>
+        <w:rPr>
+          <w:rFonts w:ascii="Arial" w:hAnsi="Arial" w:cs="Arial"/>
+          <w:color w:val="000000" w:themeColor="text1"/>
+          <w:sz w:val="24"/>
+          <w:szCs w:val="24"/>
+        </w:rPr>
+      </w:pPr>
+    </w:p>
+    <w:p>
+      <w:pPr>
+        <w:spacing w:after="0" w:line="360" w:lineRule="auto"/>
+        <w:rPr>
+          <w:rFonts w:ascii="Arial" w:hAnsi="Arial" w:cs="Arial"/>
+          <w:color w:val="000000" w:themeColor="text1"/>
+          <w:sz w:val="24"/>
+          <w:szCs w:val="24"/>
+        </w:rPr>
+      </w:pPr>
+      <w:r>
+        <w:rPr>
+          <w:rFonts w:ascii="Arial" w:hAnsi="Arial" w:cs="Arial"/>
+          <w:color w:val="000000" w:themeColor="text1"/>
+          <w:sz w:val="24"/>
+          <w:szCs w:val="24"/>
+        </w:rPr>
+        <w:t>TABLEAU PUBLIC. Projeto em BI Analytics. Disponível em:</w:t>
+      </w:r>
+    </w:p>
+    <w:p>
+      <w:pPr>
+        <w:spacing w:after="0" w:line="360" w:lineRule="auto"/>
+        <w:rPr>
+          <w:rFonts w:ascii="Arial" w:hAnsi="Arial" w:cs="Arial"/>
+          <w:color w:val="000000" w:themeColor="text1"/>
+          <w:sz w:val="24"/>
+          <w:szCs w:val="24"/>
+        </w:rPr>
+      </w:pPr>
+      <w:r>
+        <w:rPr>
+          <w:rFonts w:ascii="Arial" w:hAnsi="Arial" w:cs="Arial"/>
+          <w:color w:val="000000" w:themeColor="text1"/>
+          <w:sz w:val="24"/>
+          <w:szCs w:val="24"/>
+        </w:rPr>
+        <w:t>https://public.tableau.com/app/profile/felipe.pinheiro.foss./viz/Projeto-em-bi-analytics/Dashboard.</w:t>
+      </w:r>
+    </w:p>
+    <w:p>
+      <w:pPr>
+        <w:spacing w:after="0" w:line="360" w:lineRule="auto"/>
+        <w:rPr>
+          <w:rFonts w:ascii="Arial" w:hAnsi="Arial" w:cs="Arial"/>
+          <w:color w:val="000000" w:themeColor="text1"/>
+          <w:sz w:val="24"/>
+          <w:szCs w:val="24"/>
+          <w:lang w:val="en-US"/>
+        </w:rPr>
+      </w:pPr>
+      <w:r>
+        <w:rPr>
+          <w:rFonts w:ascii="Arial" w:hAnsi="Arial" w:cs="Arial"/>
+          <w:color w:val="000000" w:themeColor="text1"/>
+          <w:sz w:val="24"/>
+          <w:szCs w:val="24"/>
+        </w:rPr>
+        <w:t xml:space="preserve">Acesso em: </w:t>
+      </w:r>
+      <w:r>
+        <w:rPr>
+          <w:rFonts w:ascii="Arial" w:hAnsi="Arial" w:cs="Arial"/>
+          <w:color w:val="000000" w:themeColor="text1"/>
+          <w:sz w:val="24"/>
+          <w:szCs w:val="24"/>
+        </w:rPr>
+        <w:t>**</w:t>
+      </w:r>
+      <w:r>
+        <w:rPr>
+          <w:rFonts w:ascii="Arial" w:hAnsi="Arial" w:cs="Arial"/>
+          <w:color w:val="000000" w:themeColor="text1"/>
+          <w:sz w:val="24"/>
+          <w:szCs w:val="24"/>
+        </w:rPr>
+        <w:t xml:space="preserve"> ago. 2026.</w:t>
       </w:r>
     </w:p>
     <w:sectPr>
@@ -3695,6 +4118,29 @@
       <w:ind w:left="720"/>
       <w:contextualSpacing/>
     </w:pPr>
+  </w:style>
+  <w:style w:type="character" w:styleId="Hiperligao">
+    <w:name w:val="Hyperlink"/>
+    <w:basedOn w:val="Tipodeletrapredefinidodopargrafo"/>
+    <w:uiPriority w:val="99"/>
+    <w:unhideWhenUsed/>
+    <w:rsid w:val="007F2588"/>
+    <w:rPr>
+      <w:color w:val="0563C1" w:themeColor="hyperlink"/>
+      <w:u w:val="single"/>
+    </w:rPr>
+  </w:style>
+  <w:style w:type="character" w:styleId="MenoNoResolvida">
+    <w:name w:val="Unresolved Mention"/>
+    <w:basedOn w:val="Tipodeletrapredefinidodopargrafo"/>
+    <w:uiPriority w:val="99"/>
+    <w:semiHidden/>
+    <w:unhideWhenUsed/>
+    <w:rsid w:val="007F2588"/>
+    <w:rPr>
+      <w:color w:val="605E5C"/>
+      <w:shd w:val="clear" w:color="auto" w:fill="E1DFDD"/>
+    </w:rPr>
   </w:style>
 </w:styles>
 </file>

</xml_diff>

<commit_message>
feat: Adição de imagem no template, formatar em abnt
</commit_message>
<xml_diff>
--- a/docs/Template - Fase 2 - Projeto em Business Intelligence e Analytics.docx
+++ b/docs/Template - Fase 2 - Projeto em Business Intelligence e Analytics.docx
@@ -924,38 +924,6 @@
         </w:rPr>
         <w:t xml:space="preserve"> </w:t>
       </w:r>
-    </w:p>
-    <w:p>
-      <w:pPr>
-        <w:spacing w:after="60" w:line="240" w:lineRule="auto"/>
-        <w:jc w:val="both"/>
-        <w:rPr>
-          <w:rFonts w:asciiTheme="minorHAnsi" w:hAnsiTheme="minorHAnsi" w:cstheme="minorHAnsi"/>
-          <w:bCs/>
-          <w:color w:val="7B7B7B" w:themeColor="accent3" w:themeShade="BF"/>
-          <w:szCs w:val="21"/>
-        </w:rPr>
-      </w:pPr>
-      <w:r>
-        <w:rPr>
-          <w:rFonts w:asciiTheme="minorHAnsi" w:hAnsiTheme="minorHAnsi" w:cstheme="minorHAnsi"/>
-          <w:bCs/>
-          <w:color w:val="7B7B7B" w:themeColor="accent3" w:themeShade="BF"/>
-          <w:szCs w:val="21"/>
-        </w:rPr>
-        <w:t>Descreva aqui a arquitetura da solução de BI implementada. Adicione diagramas com os componentes, descreva as ferramentas e plataformas selecionadas, repositórios e eventuais dependências.</w:t>
-      </w:r>
-    </w:p>
-    <w:p>
-      <w:pPr>
-        <w:spacing w:after="0" w:line="360" w:lineRule="auto"/>
-        <w:rPr>
-          <w:rFonts w:ascii="Arial" w:hAnsi="Arial" w:cs="Arial"/>
-          <w:color w:val="000000" w:themeColor="text1"/>
-          <w:sz w:val="24"/>
-          <w:szCs w:val="24"/>
-        </w:rPr>
-      </w:pPr>
       <w:r>
         <w:rPr>
           <w:color w:val="000000" w:themeColor="text1"/>
@@ -1194,25 +1162,65 @@
           <w:sz w:val="24"/>
           <w:szCs w:val="24"/>
         </w:rPr>
+        <w:lastRenderedPageBreak/>
         <w:tab/>
       </w:r>
       <w:r>
         <w:rPr>
           <w:rFonts w:ascii="Arial" w:hAnsi="Arial" w:cs="Arial"/>
-          <w:color w:val="000000" w:themeColor="text1"/>
-          <w:sz w:val="24"/>
-          <w:szCs w:val="24"/>
-        </w:rPr>
-        <w:t>Inserir</w:t>
-      </w:r>
-      <w:r>
-        <w:rPr>
-          <w:rFonts w:ascii="Arial" w:hAnsi="Arial" w:cs="Arial"/>
-          <w:color w:val="000000" w:themeColor="text1"/>
-          <w:sz w:val="24"/>
-          <w:szCs w:val="24"/>
-        </w:rPr>
-        <w:t xml:space="preserve"> uma imagem, aqui.</w:t>
+          <w:noProof/>
+          <w:color w:val="000000" w:themeColor="text1"/>
+          <w:sz w:val="24"/>
+          <w:szCs w:val="24"/>
+        </w:rPr>
+        <w:drawing>
+          <wp:inline distT="0" distB="0" distL="0" distR="0" wp14:anchorId="101171F0" wp14:editId="27FFDD33">
+            <wp:extent cx="4152900" cy="5191125"/>
+            <wp:effectExtent l="0" t="0" r="0" b="9525"/>
+            <wp:docPr id="1846834038" name="Imagem 2"/>
+            <wp:cNvGraphicFramePr>
+              <a:graphicFrameLocks xmlns:a="http://schemas.openxmlformats.org/drawingml/2006/main" noChangeAspect="1"/>
+            </wp:cNvGraphicFramePr>
+            <a:graphic xmlns:a="http://schemas.openxmlformats.org/drawingml/2006/main">
+              <a:graphicData uri="http://schemas.openxmlformats.org/drawingml/2006/picture">
+                <pic:pic xmlns:pic="http://schemas.openxmlformats.org/drawingml/2006/picture">
+                  <pic:nvPicPr>
+                    <pic:cNvPr id="0" name="Picture 1"/>
+                    <pic:cNvPicPr>
+                      <a:picLocks noChangeAspect="1" noChangeArrowheads="1"/>
+                    </pic:cNvPicPr>
+                  </pic:nvPicPr>
+                  <pic:blipFill>
+                    <a:blip r:embed="rId11" cstate="print">
+                      <a:extLst>
+                        <a:ext uri="{28A0092B-C50C-407E-A947-70E740481C1C}">
+                          <a14:useLocalDpi xmlns:a14="http://schemas.microsoft.com/office/drawing/2010/main" val="0"/>
+                        </a:ext>
+                      </a:extLst>
+                    </a:blip>
+                    <a:srcRect/>
+                    <a:stretch>
+                      <a:fillRect/>
+                    </a:stretch>
+                  </pic:blipFill>
+                  <pic:spPr bwMode="auto">
+                    <a:xfrm>
+                      <a:off x="0" y="0"/>
+                      <a:ext cx="4153857" cy="5192321"/>
+                    </a:xfrm>
+                    <a:prstGeom prst="rect">
+                      <a:avLst/>
+                    </a:prstGeom>
+                    <a:noFill/>
+                    <a:ln>
+                      <a:noFill/>
+                    </a:ln>
+                  </pic:spPr>
+                </pic:pic>
+              </a:graphicData>
+            </a:graphic>
+          </wp:inline>
+        </w:drawing>
       </w:r>
     </w:p>
     <w:p>
@@ -1292,172 +1300,6 @@
     </w:p>
     <w:p>
       <w:pPr>
-        <w:spacing w:after="0" w:line="240" w:lineRule="auto"/>
-        <w:jc w:val="both"/>
-        <w:rPr>
-          <w:rFonts w:asciiTheme="minorHAnsi" w:hAnsiTheme="minorHAnsi" w:cstheme="minorHAnsi"/>
-          <w:bCs/>
-          <w:color w:val="7B7B7B" w:themeColor="accent3" w:themeShade="BF"/>
-          <w:szCs w:val="21"/>
-        </w:rPr>
-      </w:pPr>
-      <w:r>
-        <w:rPr>
-          <w:rFonts w:asciiTheme="minorHAnsi" w:hAnsiTheme="minorHAnsi" w:cstheme="minorHAnsi"/>
-          <w:bCs/>
-          <w:color w:val="7B7B7B" w:themeColor="accent3" w:themeShade="BF"/>
-          <w:szCs w:val="21"/>
-        </w:rPr>
-        <w:t>Descreva a solução implementada. Link para o código fonte, dicionário de dados, dashboards e análises realizadas.</w:t>
-      </w:r>
-      <w:r>
-        <w:rPr>
-          <w:rFonts w:asciiTheme="minorHAnsi" w:hAnsiTheme="minorHAnsi" w:cstheme="minorHAnsi"/>
-          <w:bCs/>
-          <w:color w:val="7B7B7B" w:themeColor="accent3" w:themeShade="BF"/>
-          <w:szCs w:val="21"/>
-        </w:rPr>
-        <w:t xml:space="preserve"> No </w:t>
-      </w:r>
-      <w:r>
-        <w:rPr>
-          <w:rFonts w:asciiTheme="minorHAnsi" w:hAnsiTheme="minorHAnsi" w:cstheme="minorHAnsi"/>
-          <w:bCs/>
-          <w:color w:val="7B7B7B" w:themeColor="accent3" w:themeShade="BF"/>
-          <w:szCs w:val="21"/>
-        </w:rPr>
-        <w:t xml:space="preserve">Link de acesso para o repositório na plataforma </w:t>
-      </w:r>
-      <w:r>
-        <w:rPr>
-          <w:rFonts w:asciiTheme="minorHAnsi" w:hAnsiTheme="minorHAnsi" w:cstheme="minorHAnsi"/>
-          <w:bCs/>
-          <w:color w:val="7B7B7B" w:themeColor="accent3" w:themeShade="BF"/>
-          <w:szCs w:val="21"/>
-        </w:rPr>
-        <w:t>GitHub</w:t>
-      </w:r>
-      <w:r>
-        <w:rPr>
-          <w:rFonts w:asciiTheme="minorHAnsi" w:hAnsiTheme="minorHAnsi" w:cstheme="minorHAnsi"/>
-          <w:bCs/>
-          <w:color w:val="7B7B7B" w:themeColor="accent3" w:themeShade="BF"/>
-          <w:szCs w:val="21"/>
-        </w:rPr>
-        <w:t xml:space="preserve"> </w:t>
-      </w:r>
-      <w:r>
-        <w:rPr>
-          <w:rFonts w:asciiTheme="minorHAnsi" w:hAnsiTheme="minorHAnsi" w:cstheme="minorHAnsi"/>
-          <w:bCs/>
-          <w:color w:val="7B7B7B" w:themeColor="accent3" w:themeShade="BF"/>
-          <w:szCs w:val="21"/>
-        </w:rPr>
-        <w:t>apresente</w:t>
-      </w:r>
-      <w:r>
-        <w:rPr>
-          <w:rFonts w:asciiTheme="minorHAnsi" w:hAnsiTheme="minorHAnsi" w:cstheme="minorHAnsi"/>
-          <w:bCs/>
-          <w:color w:val="7B7B7B" w:themeColor="accent3" w:themeShade="BF"/>
-          <w:szCs w:val="21"/>
-        </w:rPr>
-        <w:t>:</w:t>
-      </w:r>
-    </w:p>
-    <w:p>
-      <w:pPr>
-        <w:spacing w:after="0" w:line="240" w:lineRule="auto"/>
-        <w:jc w:val="both"/>
-        <w:rPr>
-          <w:rFonts w:asciiTheme="minorHAnsi" w:hAnsiTheme="minorHAnsi" w:cstheme="minorHAnsi"/>
-          <w:bCs/>
-          <w:color w:val="7B7B7B" w:themeColor="accent3" w:themeShade="BF"/>
-          <w:szCs w:val="21"/>
-        </w:rPr>
-      </w:pPr>
-      <w:r>
-        <w:rPr>
-          <w:rFonts w:asciiTheme="minorHAnsi" w:hAnsiTheme="minorHAnsi" w:cstheme="minorHAnsi"/>
-          <w:bCs/>
-          <w:color w:val="7B7B7B" w:themeColor="accent3" w:themeShade="BF"/>
-          <w:szCs w:val="21"/>
-        </w:rPr>
-        <w:t xml:space="preserve">• </w:t>
-      </w:r>
-      <w:r>
-        <w:rPr>
-          <w:rFonts w:asciiTheme="minorHAnsi" w:hAnsiTheme="minorHAnsi" w:cstheme="minorHAnsi"/>
-          <w:bCs/>
-          <w:color w:val="7B7B7B" w:themeColor="accent3" w:themeShade="BF"/>
-          <w:szCs w:val="21"/>
-        </w:rPr>
-        <w:t>Código fonte de preparação, coleta, limpeza, processamento de dados.</w:t>
-      </w:r>
-    </w:p>
-    <w:p>
-      <w:pPr>
-        <w:spacing w:after="0" w:line="240" w:lineRule="auto"/>
-        <w:jc w:val="both"/>
-        <w:rPr>
-          <w:rFonts w:asciiTheme="minorHAnsi" w:hAnsiTheme="minorHAnsi" w:cstheme="minorHAnsi"/>
-          <w:bCs/>
-          <w:color w:val="7B7B7B" w:themeColor="accent3" w:themeShade="BF"/>
-          <w:szCs w:val="21"/>
-        </w:rPr>
-      </w:pPr>
-      <w:r>
-        <w:rPr>
-          <w:rFonts w:asciiTheme="minorHAnsi" w:hAnsiTheme="minorHAnsi" w:cstheme="minorHAnsi"/>
-          <w:bCs/>
-          <w:color w:val="7B7B7B" w:themeColor="accent3" w:themeShade="BF"/>
-          <w:szCs w:val="21"/>
-        </w:rPr>
-        <w:t xml:space="preserve">• </w:t>
-      </w:r>
-      <w:r>
-        <w:rPr>
-          <w:rFonts w:asciiTheme="minorHAnsi" w:hAnsiTheme="minorHAnsi" w:cstheme="minorHAnsi"/>
-          <w:bCs/>
-          <w:color w:val="7B7B7B" w:themeColor="accent3" w:themeShade="BF"/>
-          <w:szCs w:val="21"/>
-        </w:rPr>
-        <w:t>Os Dashboards (visualizações) publicados na ferramenta escolhida.</w:t>
-      </w:r>
-    </w:p>
-    <w:p>
-      <w:pPr>
-        <w:spacing w:after="60" w:line="240" w:lineRule="auto"/>
-        <w:jc w:val="both"/>
-        <w:rPr>
-          <w:rFonts w:asciiTheme="minorHAnsi" w:hAnsiTheme="minorHAnsi" w:cstheme="minorHAnsi"/>
-          <w:bCs/>
-          <w:color w:val="7B7B7B" w:themeColor="accent3" w:themeShade="BF"/>
-          <w:sz w:val="21"/>
-          <w:szCs w:val="21"/>
-        </w:rPr>
-      </w:pPr>
-      <w:r>
-        <w:rPr>
-          <w:rFonts w:asciiTheme="minorHAnsi" w:hAnsiTheme="minorHAnsi" w:cstheme="minorHAnsi"/>
-          <w:bCs/>
-          <w:color w:val="7B7B7B" w:themeColor="accent3" w:themeShade="BF"/>
-          <w:szCs w:val="21"/>
-        </w:rPr>
-        <w:t xml:space="preserve">• </w:t>
-      </w:r>
-      <w:r>
-        <w:rPr>
-          <w:rFonts w:asciiTheme="minorHAnsi" w:hAnsiTheme="minorHAnsi" w:cstheme="minorHAnsi"/>
-          <w:bCs/>
-          <w:color w:val="7B7B7B" w:themeColor="accent3" w:themeShade="BF"/>
-          <w:szCs w:val="21"/>
-        </w:rPr>
-        <w:t>Documentação do código no GitHub.</w:t>
-      </w:r>
-    </w:p>
-    <w:p>
-      <w:pPr>
         <w:spacing w:after="0" w:line="360" w:lineRule="auto"/>
         <w:rPr>
           <w:rFonts w:ascii="Arial" w:hAnsi="Arial" w:cs="Arial"/>
@@ -1480,7 +1322,17 @@
           <w:sz w:val="24"/>
           <w:szCs w:val="24"/>
         </w:rPr>
-        <w:t xml:space="preserve">A solução de BI desenvolvida tem como objetivo transformar as previsões produzidas pelo modelo de classificação em informações visuais para análise do risco de rebaixamento dos clubes. O processo inicia-se com a base analítica clube-temporada, que contém informações de desempenho como vitórias, empates, derrotas, gols marcados, gols sofridos, pontos, saldo de gols e posição. A partir dessa base é realizada a modelagem preditiva utilizando Regressão Logística. O modelo foi avaliado por validação cruzada temporal, utilizando as temporadas anteriores para realizar previsões sobre temporadas posteriores. </w:t>
+        <w:t xml:space="preserve">A solução de BI desenvolvida tem como objetivo transformar as previsões produzidas pelo modelo de classificação em informações visuais para análise do risco de rebaixamento dos clubes. O processo inicia-se com a base analítica clube-temporada, que contém informações de desempenho como vitórias, empates, </w:t>
+      </w:r>
+      <w:r>
+        <w:rPr>
+          <w:rFonts w:ascii="Arial" w:hAnsi="Arial" w:cs="Arial"/>
+          <w:color w:val="000000" w:themeColor="text1"/>
+          <w:sz w:val="24"/>
+          <w:szCs w:val="24"/>
+        </w:rPr>
+        <w:lastRenderedPageBreak/>
+        <w:t xml:space="preserve">derrotas, gols marcados, gols sofridos, pontos, saldo de gols e posição. A partir dessa base é realizada a modelagem preditiva utilizando Regressão Logística. O modelo foi avaliado por validação cruzada temporal, utilizando as temporadas anteriores para realizar previsões sobre temporadas posteriores. </w:t>
       </w:r>
     </w:p>
     <w:p>
@@ -1668,7 +1520,6 @@
           <w:sz w:val="24"/>
           <w:szCs w:val="24"/>
         </w:rPr>
-        <w:lastRenderedPageBreak/>
         <w:t xml:space="preserve">• Gráfico de risco previsto por clube; </w:t>
       </w:r>
     </w:p>
@@ -1969,8 +1820,8 @@
       </w:r>
     </w:p>
     <w:sectPr>
-      <w:headerReference w:type="default" r:id="rId11"/>
-      <w:footerReference w:type="default" r:id="rId12"/>
+      <w:headerReference w:type="default" r:id="rId12"/>
+      <w:footerReference w:type="default" r:id="rId13"/>
       <w:pgSz w:w="11906" w:h="16838"/>
       <w:pgMar w:top="1418" w:right="1418" w:bottom="1418" w:left="1418" w:header="709" w:footer="709" w:gutter="0"/>
       <w:cols w:space="708"/>
@@ -3922,6 +3773,7 @@
   <w:style w:type="character" w:default="1" w:styleId="Tipodeletrapredefinidodopargrafo">
     <w:name w:val="Default Paragraph Font"/>
     <w:uiPriority w:val="1"/>
+    <w:semiHidden/>
     <w:unhideWhenUsed/>
   </w:style>
   <w:style w:type="table" w:default="1" w:styleId="Tabelanormal">
@@ -4474,14 +4326,19 @@
 </file>
 
 <file path=customXml/item1.xml><?xml version="1.0" encoding="utf-8"?>
-<p:properties xmlns:p="http://schemas.microsoft.com/office/2006/metadata/properties" xmlns:xsi="http://www.w3.org/2001/XMLSchema-instance" xmlns:pc="http://schemas.microsoft.com/office/infopath/2007/PartnerControls">
-  <documentManagement>
-    <_activity xmlns="73bd2b1f-886a-4f1d-b0bb-23f49d491aa9" xsi:nil="true"/>
-  </documentManagement>
-</p:properties>
+<b:Sources xmlns:b="http://schemas.openxmlformats.org/officeDocument/2006/bibliography" xmlns="http://schemas.openxmlformats.org/officeDocument/2006/bibliography" SelectedStyle="\APASixthEditionOfficeOnline.xsl" StyleName="APA" Version="6"/>
 </file>
 
 <file path=customXml/item2.xml><?xml version="1.0" encoding="utf-8"?>
+<?mso-contentType ?>
+<FormTemplates xmlns="http://schemas.microsoft.com/sharepoint/v3/contenttype/forms">
+  <Display>DocumentLibraryForm</Display>
+  <Edit>DocumentLibraryForm</Edit>
+  <New>DocumentLibraryForm</New>
+</FormTemplates>
+</file>
+
+<file path=customXml/item3.xml><?xml version="1.0" encoding="utf-8"?>
 <ct:contentTypeSchema xmlns:ct="http://schemas.microsoft.com/office/2006/metadata/contentType" xmlns:ma="http://schemas.microsoft.com/office/2006/metadata/properties/metaAttributes" ct:_="" ma:_="" ma:contentTypeName="Documento" ma:contentTypeID="0x010100B048A1A6D184364FB502BBB6EBF2C3D9" ma:contentTypeVersion="14" ma:contentTypeDescription="Crie um novo documento." ma:contentTypeScope="" ma:versionID="d7146710810563b9c6e4c1a91b60f5f9">
   <xsd:schema xmlns:xsd="http://www.w3.org/2001/XMLSchema" xmlns:xs="http://www.w3.org/2001/XMLSchema" xmlns:p="http://schemas.microsoft.com/office/2006/metadata/properties" xmlns:ns3="73bd2b1f-886a-4f1d-b0bb-23f49d491aa9" xmlns:ns4="85818a3c-b8e7-4f75-b80a-610982c277d3" targetNamespace="http://schemas.microsoft.com/office/2006/metadata/properties" ma:root="true" ma:fieldsID="8b8875638ef7369d6012dd60a980de1b" ns3:_="" ns4:_="">
     <xsd:import namespace="73bd2b1f-886a-4f1d-b0bb-23f49d491aa9"/>
@@ -4710,30 +4567,31 @@
 </ct:contentTypeSchema>
 </file>
 
-<file path=customXml/item3.xml><?xml version="1.0" encoding="utf-8"?>
-<?mso-contentType ?>
-<FormTemplates xmlns="http://schemas.microsoft.com/sharepoint/v3/contenttype/forms">
-  <Display>DocumentLibraryForm</Display>
-  <Edit>DocumentLibraryForm</Edit>
-  <New>DocumentLibraryForm</New>
-</FormTemplates>
-</file>
-
 <file path=customXml/item4.xml><?xml version="1.0" encoding="utf-8"?>
-<b:Sources xmlns:b="http://schemas.openxmlformats.org/officeDocument/2006/bibliography" xmlns="http://schemas.openxmlformats.org/officeDocument/2006/bibliography" SelectedStyle="\APASixthEditionOfficeOnline.xsl" StyleName="APA" Version="6"/>
+<p:properties xmlns:p="http://schemas.microsoft.com/office/2006/metadata/properties" xmlns:xsi="http://www.w3.org/2001/XMLSchema-instance" xmlns:pc="http://schemas.microsoft.com/office/infopath/2007/PartnerControls">
+  <documentManagement>
+    <_activity xmlns="73bd2b1f-886a-4f1d-b0bb-23f49d491aa9" xsi:nil="true"/>
+  </documentManagement>
+</p:properties>
 </file>
 
 <file path=customXml/itemProps1.xml><?xml version="1.0" encoding="utf-8"?>
-<ds:datastoreItem xmlns:ds="http://schemas.openxmlformats.org/officeDocument/2006/customXml" ds:itemID="{10811A0B-354D-477E-AF27-C929DD9532C2}">
+<ds:datastoreItem xmlns:ds="http://schemas.openxmlformats.org/officeDocument/2006/customXml" ds:itemID="{F61111CE-2DDF-46E8-9D66-B3D8C921A39E}">
   <ds:schemaRefs>
-    <ds:schemaRef ds:uri="http://schemas.microsoft.com/office/2006/metadata/properties"/>
-    <ds:schemaRef ds:uri="http://schemas.microsoft.com/office/infopath/2007/PartnerControls"/>
-    <ds:schemaRef ds:uri="73bd2b1f-886a-4f1d-b0bb-23f49d491aa9"/>
+    <ds:schemaRef ds:uri="http://schemas.openxmlformats.org/officeDocument/2006/bibliography"/>
   </ds:schemaRefs>
 </ds:datastoreItem>
 </file>
 
 <file path=customXml/itemProps2.xml><?xml version="1.0" encoding="utf-8"?>
+<ds:datastoreItem xmlns:ds="http://schemas.openxmlformats.org/officeDocument/2006/customXml" ds:itemID="{0593B9FC-456C-46BA-ABE7-4E86A6CE6864}">
+  <ds:schemaRefs>
+    <ds:schemaRef ds:uri="http://schemas.microsoft.com/sharepoint/v3/contenttype/forms"/>
+  </ds:schemaRefs>
+</ds:datastoreItem>
+</file>
+
+<file path=customXml/itemProps3.xml><?xml version="1.0" encoding="utf-8"?>
 <ds:datastoreItem xmlns:ds="http://schemas.openxmlformats.org/officeDocument/2006/customXml" ds:itemID="{D06ADA8E-DF43-49D2-A0A1-50B9B3A2B035}">
   <ds:schemaRefs>
     <ds:schemaRef ds:uri="http://schemas.microsoft.com/office/2006/metadata/contentType"/>
@@ -4752,18 +4610,12 @@
 </ds:datastoreItem>
 </file>
 
-<file path=customXml/itemProps3.xml><?xml version="1.0" encoding="utf-8"?>
-<ds:datastoreItem xmlns:ds="http://schemas.openxmlformats.org/officeDocument/2006/customXml" ds:itemID="{0593B9FC-456C-46BA-ABE7-4E86A6CE6864}">
+<file path=customXml/itemProps4.xml><?xml version="1.0" encoding="utf-8"?>
+<ds:datastoreItem xmlns:ds="http://schemas.openxmlformats.org/officeDocument/2006/customXml" ds:itemID="{10811A0B-354D-477E-AF27-C929DD9532C2}">
   <ds:schemaRefs>
-    <ds:schemaRef ds:uri="http://schemas.microsoft.com/sharepoint/v3/contenttype/forms"/>
-  </ds:schemaRefs>
-</ds:datastoreItem>
-</file>
-
-<file path=customXml/itemProps4.xml><?xml version="1.0" encoding="utf-8"?>
-<ds:datastoreItem xmlns:ds="http://schemas.openxmlformats.org/officeDocument/2006/customXml" ds:itemID="{F61111CE-2DDF-46E8-9D66-B3D8C921A39E}">
-  <ds:schemaRefs>
-    <ds:schemaRef ds:uri="http://schemas.openxmlformats.org/officeDocument/2006/bibliography"/>
+    <ds:schemaRef ds:uri="http://schemas.microsoft.com/office/2006/metadata/properties"/>
+    <ds:schemaRef ds:uri="http://schemas.microsoft.com/office/infopath/2007/PartnerControls"/>
+    <ds:schemaRef ds:uri="73bd2b1f-886a-4f1d-b0bb-23f49d491aa9"/>
   </ds:schemaRefs>
 </ds:datastoreItem>
 </file>
</xml_diff>

<commit_message>
feat: formato em abnt Template
</commit_message>
<xml_diff>
--- a/docs/Template - Fase 2 - Projeto em Business Intelligence e Analytics.docx
+++ b/docs/Template - Fase 2 - Projeto em Business Intelligence e Analytics.docx
@@ -191,6 +191,7 @@
     <w:p>
       <w:pPr>
         <w:spacing w:after="0" w:line="360" w:lineRule="auto"/>
+        <w:jc w:val="both"/>
         <w:rPr>
           <w:rFonts w:ascii="Arial" w:hAnsi="Arial" w:cs="Arial"/>
           <w:color w:val="000000" w:themeColor="text1"/>
@@ -217,6 +218,7 @@
     <w:p>
       <w:pPr>
         <w:spacing w:after="0" w:line="360" w:lineRule="auto"/>
+        <w:jc w:val="both"/>
         <w:rPr>
           <w:rFonts w:ascii="Arial" w:hAnsi="Arial" w:cs="Arial"/>
           <w:color w:val="000000" w:themeColor="text1"/>
@@ -232,6 +234,7 @@
           <w:numId w:val="11"/>
         </w:numPr>
         <w:spacing w:after="0" w:line="360" w:lineRule="auto"/>
+        <w:jc w:val="both"/>
         <w:rPr>
           <w:rFonts w:ascii="Arial" w:hAnsi="Arial" w:cs="Arial"/>
           <w:color w:val="000000" w:themeColor="text1"/>
@@ -315,6 +318,7 @@
     <w:p>
       <w:pPr>
         <w:spacing w:after="0" w:line="360" w:lineRule="auto"/>
+        <w:jc w:val="both"/>
         <w:rPr>
           <w:rFonts w:ascii="Arial" w:hAnsi="Arial" w:cs="Arial"/>
           <w:color w:val="000000" w:themeColor="text1"/>
@@ -330,6 +334,7 @@
           <w:numId w:val="11"/>
         </w:numPr>
         <w:spacing w:after="0" w:line="360" w:lineRule="auto"/>
+        <w:jc w:val="both"/>
         <w:rPr>
           <w:rFonts w:ascii="Arial" w:hAnsi="Arial" w:cs="Arial"/>
           <w:color w:val="000000" w:themeColor="text1"/>
@@ -394,6 +399,7 @@
     <w:p>
       <w:pPr>
         <w:spacing w:after="0" w:line="360" w:lineRule="auto"/>
+        <w:jc w:val="both"/>
         <w:rPr>
           <w:rFonts w:ascii="Arial" w:hAnsi="Arial" w:cs="Arial"/>
           <w:color w:val="000000" w:themeColor="text1"/>
@@ -409,6 +415,7 @@
           <w:numId w:val="11"/>
         </w:numPr>
         <w:spacing w:after="0" w:line="360" w:lineRule="auto"/>
+        <w:jc w:val="both"/>
         <w:rPr>
           <w:rFonts w:ascii="Arial" w:hAnsi="Arial" w:cs="Arial"/>
           <w:color w:val="000000" w:themeColor="text1"/>
@@ -473,6 +480,7 @@
     <w:p>
       <w:pPr>
         <w:spacing w:after="0" w:line="360" w:lineRule="auto"/>
+        <w:jc w:val="both"/>
         <w:rPr>
           <w:rFonts w:ascii="Arial" w:hAnsi="Arial" w:cs="Arial"/>
           <w:color w:val="000000" w:themeColor="text1"/>
@@ -488,6 +496,7 @@
           <w:numId w:val="11"/>
         </w:numPr>
         <w:spacing w:after="0" w:line="360" w:lineRule="auto"/>
+        <w:jc w:val="both"/>
         <w:rPr>
           <w:rFonts w:ascii="Arial" w:hAnsi="Arial" w:cs="Arial"/>
           <w:color w:val="000000" w:themeColor="text1"/>
@@ -560,6 +569,7 @@
     <w:p>
       <w:pPr>
         <w:spacing w:after="0" w:line="360" w:lineRule="auto"/>
+        <w:jc w:val="both"/>
         <w:rPr>
           <w:rFonts w:ascii="Arial" w:hAnsi="Arial" w:cs="Arial"/>
           <w:color w:val="000000" w:themeColor="text1"/>
@@ -575,6 +585,7 @@
           <w:numId w:val="11"/>
         </w:numPr>
         <w:spacing w:after="0" w:line="360" w:lineRule="auto"/>
+        <w:jc w:val="both"/>
         <w:rPr>
           <w:rFonts w:ascii="Arial" w:hAnsi="Arial" w:cs="Arial"/>
           <w:color w:val="000000" w:themeColor="text1"/>
@@ -641,6 +652,7 @@
     <w:p>
       <w:pPr>
         <w:spacing w:after="0" w:line="360" w:lineRule="auto"/>
+        <w:jc w:val="both"/>
         <w:rPr>
           <w:rFonts w:ascii="Arial" w:hAnsi="Arial" w:cs="Arial"/>
           <w:color w:val="000000" w:themeColor="text1"/>
@@ -656,6 +668,7 @@
           <w:numId w:val="11"/>
         </w:numPr>
         <w:spacing w:after="0" w:line="360" w:lineRule="auto"/>
+        <w:jc w:val="both"/>
         <w:rPr>
           <w:rFonts w:ascii="Arial" w:hAnsi="Arial" w:cs="Arial"/>
           <w:color w:val="000000" w:themeColor="text1"/>
@@ -740,6 +753,7 @@
     <w:p>
       <w:pPr>
         <w:spacing w:after="0" w:line="360" w:lineRule="auto"/>
+        <w:jc w:val="both"/>
         <w:rPr>
           <w:rFonts w:ascii="Arial" w:hAnsi="Arial" w:cs="Arial"/>
           <w:color w:val="000000" w:themeColor="text1"/>
@@ -751,6 +765,7 @@
       <w:pPr>
         <w:spacing w:after="0" w:line="360" w:lineRule="auto"/>
         <w:ind w:firstLine="360"/>
+        <w:jc w:val="both"/>
         <w:rPr>
           <w:rFonts w:ascii="Arial" w:hAnsi="Arial" w:cs="Arial"/>
           <w:color w:val="000000" w:themeColor="text1"/>
@@ -825,7 +840,7 @@
     </w:p>
     <w:p>
       <w:pPr>
-        <w:spacing w:before="720" w:after="0" w:line="240" w:lineRule="auto"/>
+        <w:spacing w:before="720" w:after="0" w:line="360" w:lineRule="auto"/>
         <w:jc w:val="both"/>
         <w:rPr>
           <w:rFonts w:asciiTheme="minorHAnsi" w:hAnsiTheme="minorHAnsi" w:cstheme="minorHAnsi"/>
@@ -998,6 +1013,7 @@
     <w:p>
       <w:pPr>
         <w:spacing w:after="0" w:line="360" w:lineRule="auto"/>
+        <w:jc w:val="both"/>
         <w:rPr>
           <w:rFonts w:ascii="Arial" w:hAnsi="Arial" w:cs="Arial"/>
           <w:color w:val="000000" w:themeColor="text1"/>
@@ -1055,6 +1071,7 @@
     <w:p>
       <w:pPr>
         <w:spacing w:after="0" w:line="360" w:lineRule="auto"/>
+        <w:jc w:val="both"/>
         <w:rPr>
           <w:rFonts w:ascii="Arial" w:hAnsi="Arial" w:cs="Arial"/>
           <w:color w:val="000000" w:themeColor="text1"/>
@@ -1148,21 +1165,64 @@
     <w:p>
       <w:pPr>
         <w:spacing w:after="0" w:line="360" w:lineRule="auto"/>
-        <w:rPr>
-          <w:rFonts w:ascii="Arial" w:hAnsi="Arial" w:cs="Arial"/>
-          <w:color w:val="000000" w:themeColor="text1"/>
-          <w:sz w:val="24"/>
-          <w:szCs w:val="24"/>
-        </w:rPr>
-      </w:pPr>
-      <w:r>
-        <w:rPr>
-          <w:rFonts w:ascii="Arial" w:hAnsi="Arial" w:cs="Arial"/>
-          <w:color w:val="000000" w:themeColor="text1"/>
-          <w:sz w:val="24"/>
-          <w:szCs w:val="24"/>
+        <w:jc w:val="both"/>
+        <w:rPr>
+          <w:rFonts w:ascii="Arial" w:hAnsi="Arial" w:cs="Arial"/>
+          <w:color w:val="000000" w:themeColor="text1"/>
+          <w:sz w:val="24"/>
+          <w:szCs w:val="24"/>
+        </w:rPr>
+      </w:pPr>
+      <w:r>
+        <w:rPr>
+          <w:rFonts w:ascii="Arial" w:hAnsi="Arial" w:cs="Arial"/>
+          <w:color w:val="000000" w:themeColor="text1"/>
+          <w:sz w:val="24"/>
+          <w:szCs w:val="24"/>
+        </w:rPr>
+        <w:tab/>
+        <w:t>Abaixo uma imagem que ilustra as etapas feitas para o projeto em Business Inteligence e Analytics.</w:t>
+      </w:r>
+    </w:p>
+    <w:p>
+      <w:pPr>
+        <w:spacing w:after="0" w:line="360" w:lineRule="auto"/>
+        <w:rPr>
+          <w:rFonts w:ascii="Arial" w:hAnsi="Arial" w:cs="Arial"/>
+          <w:color w:val="000000" w:themeColor="text1"/>
+          <w:sz w:val="24"/>
+          <w:szCs w:val="24"/>
+        </w:rPr>
+      </w:pPr>
+    </w:p>
+    <w:p>
+      <w:pPr>
+        <w:spacing w:after="0" w:line="360" w:lineRule="auto"/>
+        <w:jc w:val="center"/>
+        <w:rPr>
+          <w:rFonts w:ascii="Arial" w:hAnsi="Arial" w:cs="Arial"/>
+          <w:color w:val="000000" w:themeColor="text1"/>
+          <w:sz w:val="24"/>
+          <w:szCs w:val="24"/>
+        </w:rPr>
+      </w:pPr>
+      <w:r>
+        <w:rPr>
+          <w:rFonts w:ascii="Arial" w:hAnsi="Arial" w:cs="Arial"/>
+          <w:color w:val="000000" w:themeColor="text1"/>
+          <w:sz w:val="20"/>
+          <w:szCs w:val="20"/>
         </w:rPr>
         <w:lastRenderedPageBreak/>
+        <w:t>Imagem 1 – Etapas para projeto em Business Inteligence e Analytics</w:t>
+      </w:r>
+      <w:r>
+        <w:rPr>
+          <w:rFonts w:ascii="Arial" w:hAnsi="Arial" w:cs="Arial"/>
+          <w:color w:val="000000" w:themeColor="text1"/>
+          <w:sz w:val="24"/>
+          <w:szCs w:val="24"/>
+        </w:rPr>
         <w:tab/>
       </w:r>
       <w:r>
@@ -1174,7 +1234,7 @@
           <w:szCs w:val="24"/>
         </w:rPr>
         <w:drawing>
-          <wp:inline distT="0" distB="0" distL="0" distR="0" wp14:anchorId="101171F0" wp14:editId="27FFDD33">
+          <wp:inline distT="0" distB="0" distL="0" distR="0" wp14:anchorId="101171F0" wp14:editId="2AF8E229">
             <wp:extent cx="4152900" cy="5191125"/>
             <wp:effectExtent l="0" t="0" r="0" b="9525"/>
             <wp:docPr id="1846834038" name="Imagem 2"/>
@@ -1225,6 +1285,27 @@
     </w:p>
     <w:p>
       <w:pPr>
+        <w:spacing w:after="0" w:line="360" w:lineRule="auto"/>
+        <w:jc w:val="center"/>
+        <w:rPr>
+          <w:rFonts w:ascii="Arial" w:hAnsi="Arial" w:cs="Arial"/>
+          <w:color w:val="000000" w:themeColor="text1"/>
+          <w:sz w:val="20"/>
+          <w:szCs w:val="20"/>
+        </w:rPr>
+      </w:pPr>
+      <w:r>
+        <w:rPr>
+          <w:rFonts w:ascii="Arial" w:hAnsi="Arial" w:cs="Arial"/>
+          <w:color w:val="000000" w:themeColor="text1"/>
+          <w:sz w:val="20"/>
+          <w:szCs w:val="20"/>
+        </w:rPr>
+        <w:t>Fonte: elaborado pelo autor (2026).</w:t>
+      </w:r>
+    </w:p>
+    <w:p>
+      <w:pPr>
         <w:spacing w:before="720" w:after="0" w:line="240" w:lineRule="auto"/>
         <w:jc w:val="both"/>
         <w:rPr>
@@ -1236,11 +1317,7 @@
           <w:szCs w:val="23"/>
         </w:rPr>
       </w:pPr>
-    </w:p>
-    <w:p>
-      <w:pPr>
-        <w:spacing w:before="720" w:after="0" w:line="240" w:lineRule="auto"/>
-        <w:jc w:val="both"/>
+      <w:r>
         <w:rPr>
           <w:rFonts w:asciiTheme="minorHAnsi" w:hAnsiTheme="minorHAnsi" w:cstheme="minorHAnsi"/>
           <w:b/>
@@ -1249,12 +1326,9 @@
           <w:sz w:val="24"/>
           <w:szCs w:val="23"/>
         </w:rPr>
-      </w:pPr>
-    </w:p>
-    <w:p>
-      <w:pPr>
-        <w:spacing w:before="720" w:after="0" w:line="240" w:lineRule="auto"/>
-        <w:jc w:val="both"/>
+        <w:t xml:space="preserve">3. </w:t>
+      </w:r>
+      <w:r>
         <w:rPr>
           <w:rFonts w:asciiTheme="minorHAnsi" w:hAnsiTheme="minorHAnsi" w:cstheme="minorHAnsi"/>
           <w:b/>
@@ -1263,7 +1337,8 @@
           <w:sz w:val="24"/>
           <w:szCs w:val="23"/>
         </w:rPr>
-      </w:pPr>
+        <w:t>Solução de BI</w:t>
+      </w:r>
       <w:r>
         <w:rPr>
           <w:rFonts w:asciiTheme="minorHAnsi" w:hAnsiTheme="minorHAnsi" w:cstheme="minorHAnsi"/>
@@ -1273,34 +1348,13 @@
           <w:sz w:val="24"/>
           <w:szCs w:val="23"/>
         </w:rPr>
-        <w:t xml:space="preserve">3. </w:t>
-      </w:r>
-      <w:r>
-        <w:rPr>
-          <w:rFonts w:asciiTheme="minorHAnsi" w:hAnsiTheme="minorHAnsi" w:cstheme="minorHAnsi"/>
-          <w:b/>
-          <w:bCs/>
-          <w:color w:val="4664BE"/>
-          <w:sz w:val="24"/>
-          <w:szCs w:val="23"/>
-        </w:rPr>
-        <w:t>Solução de BI</w:t>
-      </w:r>
-      <w:r>
-        <w:rPr>
-          <w:rFonts w:asciiTheme="minorHAnsi" w:hAnsiTheme="minorHAnsi" w:cstheme="minorHAnsi"/>
-          <w:b/>
-          <w:bCs/>
-          <w:color w:val="4664BE"/>
-          <w:sz w:val="24"/>
-          <w:szCs w:val="23"/>
-        </w:rPr>
         <w:t>:</w:t>
       </w:r>
     </w:p>
     <w:p>
       <w:pPr>
         <w:spacing w:after="0" w:line="360" w:lineRule="auto"/>
+        <w:jc w:val="both"/>
         <w:rPr>
           <w:rFonts w:ascii="Arial" w:hAnsi="Arial" w:cs="Arial"/>
           <w:color w:val="000000" w:themeColor="text1"/>
@@ -1322,7 +1376,7 @@
           <w:sz w:val="24"/>
           <w:szCs w:val="24"/>
         </w:rPr>
-        <w:t xml:space="preserve">A solução de BI desenvolvida tem como objetivo transformar as previsões produzidas pelo modelo de classificação em informações visuais para análise do risco de rebaixamento dos clubes. O processo inicia-se com a base analítica clube-temporada, que contém informações de desempenho como vitórias, empates, </w:t>
+        <w:t xml:space="preserve">A solução de BI desenvolvida tem como objetivo transformar as previsões produzidas pelo modelo de classificação em informações visuais para análise do risco de rebaixamento dos clubes. O processo inicia-se com a base analítica clube-temporada, que contém informações de desempenho como vitórias, empates, derrotas, gols marcados, gols sofridos, pontos, saldo de gols e posição. A partir dessa base é realizada a modelagem preditiva utilizando Regressão Logística. O modelo foi </w:t>
       </w:r>
       <w:r>
         <w:rPr>
@@ -1332,13 +1386,14 @@
           <w:szCs w:val="24"/>
         </w:rPr>
         <w:lastRenderedPageBreak/>
-        <w:t xml:space="preserve">derrotas, gols marcados, gols sofridos, pontos, saldo de gols e posição. A partir dessa base é realizada a modelagem preditiva utilizando Regressão Logística. O modelo foi avaliado por validação cruzada temporal, utilizando as temporadas anteriores para realizar previsões sobre temporadas posteriores. </w:t>
+        <w:t xml:space="preserve">avaliado por validação cruzada temporal, utilizando as temporadas anteriores para realizar previsões sobre temporadas posteriores. </w:t>
       </w:r>
     </w:p>
     <w:p>
       <w:pPr>
         <w:spacing w:after="0" w:line="360" w:lineRule="auto"/>
         <w:ind w:firstLine="708"/>
+        <w:jc w:val="both"/>
         <w:rPr>
           <w:rFonts w:ascii="Arial" w:hAnsi="Arial" w:cs="Arial"/>
           <w:color w:val="000000" w:themeColor="text1"/>
@@ -1360,6 +1415,7 @@
       <w:pPr>
         <w:spacing w:after="0" w:line="360" w:lineRule="auto"/>
         <w:ind w:firstLine="708"/>
+        <w:jc w:val="both"/>
         <w:rPr>
           <w:rFonts w:ascii="Arial" w:hAnsi="Arial" w:cs="Arial"/>
           <w:color w:val="000000" w:themeColor="text1"/>
@@ -1401,6 +1457,7 @@
       <w:pPr>
         <w:spacing w:after="0" w:line="360" w:lineRule="auto"/>
         <w:ind w:firstLine="708"/>
+        <w:jc w:val="both"/>
         <w:rPr>
           <w:rFonts w:ascii="Arial" w:hAnsi="Arial" w:cs="Arial"/>
           <w:color w:val="000000" w:themeColor="text1"/>
@@ -1422,6 +1479,7 @@
       <w:pPr>
         <w:spacing w:after="0" w:line="360" w:lineRule="auto"/>
         <w:ind w:firstLine="708"/>
+        <w:jc w:val="both"/>
         <w:rPr>
           <w:rFonts w:ascii="Arial" w:hAnsi="Arial" w:cs="Arial"/>
           <w:color w:val="000000" w:themeColor="text1"/>
@@ -1443,6 +1501,7 @@
       <w:pPr>
         <w:spacing w:after="0" w:line="360" w:lineRule="auto"/>
         <w:ind w:firstLine="708"/>
+        <w:jc w:val="both"/>
         <w:rPr>
           <w:rFonts w:ascii="Arial" w:hAnsi="Arial" w:cs="Arial"/>
           <w:color w:val="000000" w:themeColor="text1"/>
@@ -1464,6 +1523,7 @@
       <w:pPr>
         <w:spacing w:after="0" w:line="360" w:lineRule="auto"/>
         <w:ind w:firstLine="708"/>
+        <w:jc w:val="both"/>
         <w:rPr>
           <w:rFonts w:ascii="Arial" w:hAnsi="Arial" w:cs="Arial"/>
           <w:color w:val="000000" w:themeColor="text1"/>
@@ -1485,6 +1545,7 @@
       <w:pPr>
         <w:spacing w:after="0" w:line="360" w:lineRule="auto"/>
         <w:ind w:firstLine="708"/>
+        <w:jc w:val="both"/>
         <w:rPr>
           <w:rFonts w:ascii="Arial" w:hAnsi="Arial" w:cs="Arial"/>
           <w:color w:val="000000" w:themeColor="text1"/>
@@ -1506,6 +1567,7 @@
       <w:pPr>
         <w:spacing w:after="0" w:line="360" w:lineRule="auto"/>
         <w:ind w:firstLine="708"/>
+        <w:jc w:val="both"/>
         <w:rPr>
           <w:rFonts w:ascii="Arial" w:hAnsi="Arial" w:cs="Arial"/>
           <w:color w:val="000000" w:themeColor="text1"/>
@@ -1527,6 +1589,7 @@
       <w:pPr>
         <w:spacing w:after="0" w:line="360" w:lineRule="auto"/>
         <w:ind w:firstLine="708"/>
+        <w:jc w:val="both"/>
         <w:rPr>
           <w:rFonts w:ascii="Arial" w:hAnsi="Arial" w:cs="Arial"/>
           <w:color w:val="000000" w:themeColor="text1"/>
@@ -1548,6 +1611,7 @@
       <w:pPr>
         <w:spacing w:after="0" w:line="360" w:lineRule="auto"/>
         <w:ind w:firstLine="708"/>
+        <w:jc w:val="both"/>
         <w:rPr>
           <w:rFonts w:ascii="Arial" w:hAnsi="Arial" w:cs="Arial"/>
           <w:color w:val="000000" w:themeColor="text1"/>
@@ -1560,6 +1624,7 @@
       <w:pPr>
         <w:spacing w:after="0" w:line="360" w:lineRule="auto"/>
         <w:ind w:firstLine="708"/>
+        <w:jc w:val="both"/>
         <w:rPr>
           <w:rFonts w:ascii="Arial" w:hAnsi="Arial" w:cs="Arial"/>
           <w:color w:val="000000" w:themeColor="text1"/>
@@ -1581,6 +1646,7 @@
       <w:pPr>
         <w:spacing w:after="0" w:line="360" w:lineRule="auto"/>
         <w:ind w:firstLine="708"/>
+        <w:jc w:val="both"/>
         <w:rPr>
           <w:rFonts w:ascii="Arial" w:hAnsi="Arial" w:cs="Arial"/>
           <w:color w:val="000000" w:themeColor="text1"/>
@@ -1592,20 +1658,34 @@
     <w:p>
       <w:pPr>
         <w:spacing w:after="0" w:line="360" w:lineRule="auto"/>
-        <w:rPr>
-          <w:rFonts w:ascii="Arial" w:hAnsi="Arial" w:cs="Arial"/>
-          <w:color w:val="000000" w:themeColor="text1"/>
-          <w:sz w:val="24"/>
-          <w:szCs w:val="24"/>
-        </w:rPr>
-      </w:pPr>
-      <w:r>
-        <w:rPr>
-          <w:rFonts w:ascii="Arial" w:hAnsi="Arial" w:cs="Arial"/>
-          <w:color w:val="000000" w:themeColor="text1"/>
-          <w:sz w:val="24"/>
-          <w:szCs w:val="24"/>
-        </w:rPr>
+        <w:ind w:firstLine="708"/>
+        <w:jc w:val="both"/>
+        <w:rPr>
+          <w:rFonts w:ascii="Arial" w:hAnsi="Arial" w:cs="Arial"/>
+          <w:color w:val="000000" w:themeColor="text1"/>
+          <w:sz w:val="24"/>
+          <w:szCs w:val="24"/>
+        </w:rPr>
+      </w:pPr>
+    </w:p>
+    <w:p>
+      <w:pPr>
+        <w:spacing w:after="0" w:line="360" w:lineRule="auto"/>
+        <w:rPr>
+          <w:rFonts w:ascii="Arial" w:hAnsi="Arial" w:cs="Arial"/>
+          <w:color w:val="000000" w:themeColor="text1"/>
+          <w:sz w:val="24"/>
+          <w:szCs w:val="24"/>
+        </w:rPr>
+      </w:pPr>
+      <w:r>
+        <w:rPr>
+          <w:rFonts w:ascii="Arial" w:hAnsi="Arial" w:cs="Arial"/>
+          <w:color w:val="000000" w:themeColor="text1"/>
+          <w:sz w:val="24"/>
+          <w:szCs w:val="24"/>
+        </w:rPr>
+        <w:lastRenderedPageBreak/>
         <w:t>Acesso ao repositório do projeto:</w:t>
       </w:r>
     </w:p>
@@ -1686,16 +1766,34 @@
           <w:sz w:val="24"/>
           <w:szCs w:val="24"/>
         </w:rPr>
-        <w:t>**</w:t>
-      </w:r>
-      <w:r>
-        <w:rPr>
-          <w:rFonts w:ascii="Arial" w:hAnsi="Arial" w:cs="Arial"/>
-          <w:color w:val="000000" w:themeColor="text1"/>
-          <w:sz w:val="24"/>
-          <w:szCs w:val="24"/>
-        </w:rPr>
-        <w:t xml:space="preserve"> ago. 2026.</w:t>
+        <w:t>06</w:t>
+      </w:r>
+      <w:r>
+        <w:rPr>
+          <w:rFonts w:ascii="Arial" w:hAnsi="Arial" w:cs="Arial"/>
+          <w:color w:val="000000" w:themeColor="text1"/>
+          <w:sz w:val="24"/>
+          <w:szCs w:val="24"/>
+        </w:rPr>
+        <w:t xml:space="preserve"> </w:t>
+      </w:r>
+      <w:r>
+        <w:rPr>
+          <w:rFonts w:ascii="Arial" w:hAnsi="Arial" w:cs="Arial"/>
+          <w:color w:val="000000" w:themeColor="text1"/>
+          <w:sz w:val="24"/>
+          <w:szCs w:val="24"/>
+        </w:rPr>
+        <w:t>set</w:t>
+      </w:r>
+      <w:r>
+        <w:rPr>
+          <w:rFonts w:ascii="Arial" w:hAnsi="Arial" w:cs="Arial"/>
+          <w:color w:val="000000" w:themeColor="text1"/>
+          <w:sz w:val="24"/>
+          <w:szCs w:val="24"/>
+        </w:rPr>
+        <w:t>. 2026.</w:t>
       </w:r>
     </w:p>
     <w:p>
@@ -1807,16 +1905,34 @@
           <w:sz w:val="24"/>
           <w:szCs w:val="24"/>
         </w:rPr>
-        <w:t>**</w:t>
-      </w:r>
-      <w:r>
-        <w:rPr>
-          <w:rFonts w:ascii="Arial" w:hAnsi="Arial" w:cs="Arial"/>
-          <w:color w:val="000000" w:themeColor="text1"/>
-          <w:sz w:val="24"/>
-          <w:szCs w:val="24"/>
-        </w:rPr>
-        <w:t xml:space="preserve"> ago. 2026.</w:t>
+        <w:t>06</w:t>
+      </w:r>
+      <w:r>
+        <w:rPr>
+          <w:rFonts w:ascii="Arial" w:hAnsi="Arial" w:cs="Arial"/>
+          <w:color w:val="000000" w:themeColor="text1"/>
+          <w:sz w:val="24"/>
+          <w:szCs w:val="24"/>
+        </w:rPr>
+        <w:t xml:space="preserve"> </w:t>
+      </w:r>
+      <w:r>
+        <w:rPr>
+          <w:rFonts w:ascii="Arial" w:hAnsi="Arial" w:cs="Arial"/>
+          <w:color w:val="000000" w:themeColor="text1"/>
+          <w:sz w:val="24"/>
+          <w:szCs w:val="24"/>
+        </w:rPr>
+        <w:t>set</w:t>
+      </w:r>
+      <w:r>
+        <w:rPr>
+          <w:rFonts w:ascii="Arial" w:hAnsi="Arial" w:cs="Arial"/>
+          <w:color w:val="000000" w:themeColor="text1"/>
+          <w:sz w:val="24"/>
+          <w:szCs w:val="24"/>
+        </w:rPr>
+        <w:t>. 2026.</w:t>
       </w:r>
     </w:p>
     <w:sectPr>
@@ -1940,11 +2056,11 @@
         </mc:Choice>
         <mc:Fallback>
           <w:pict>
-            <v:shapetype w14:anchorId="3D21F263" id="_x0000_t32" coordsize="21600,21600" o:spt="32" o:oned="t" path="m,l21600,21600e" filled="f">
+            <v:shapetype w14:anchorId="0E75C65B" id="_x0000_t32" coordsize="21600,21600" o:spt="32" o:oned="t" path="m,l21600,21600e" filled="f">
               <v:path arrowok="t" fillok="f" o:connecttype="none"/>
               <o:lock v:ext="edit" shapetype="t"/>
             </v:shapetype>
-            <v:shape id="Conector de Seta Reta 2" o:spid="_x0000_s1026" type="#_x0000_t32" style="position:absolute;margin-left:-14.45pt;margin-top:20.2pt;width:481.9pt;height:0;z-index:251658241;visibility:visible;mso-wrap-style:square;mso-width-percent:0;mso-height-percent:0;mso-wrap-distance-left:9pt;mso-wrap-distance-top:0;mso-wrap-distance-right:9pt;mso-wrap-distance-bottom:0;mso-position-horizontal:absolute;mso-position-horizontal-relative:margin;mso-position-vertical:absolute;mso-position-vertical-relative:text;mso-width-percent:0;mso-height-percent:0;mso-width-relative:page;mso-height-relative:page" o:gfxdata="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" strokecolor="#0066b3">
+            <v:shape id="Conector de Seta Reta 2" o:spid="_x0000_s1026" type="#_x0000_t32" style="position:absolute;margin-left:-14.45pt;margin-top:20.2pt;width:481.9pt;height:0;z-index:251658241;visibility:visible;mso-wrap-style:square;mso-width-percent:0;mso-height-percent:0;mso-wrap-distance-left:9pt;mso-wrap-distance-top:0;mso-wrap-distance-right:9pt;mso-wrap-distance-bottom:0;mso-position-horizontal:absolute;mso-position-horizontal-relative:margin;mso-position-vertical:absolute;mso-position-vertical-relative:text;mso-width-percent:0;mso-height-percent:0;mso-width-relative:page;mso-height-relative:page" o:gfxdata="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" strokecolor="#0066b3">
               <w10:wrap anchorx="margin"/>
             </v:shape>
           </w:pict>
@@ -4326,19 +4442,14 @@
 </file>
 
 <file path=customXml/item1.xml><?xml version="1.0" encoding="utf-8"?>
-<b:Sources xmlns:b="http://schemas.openxmlformats.org/officeDocument/2006/bibliography" xmlns="http://schemas.openxmlformats.org/officeDocument/2006/bibliography" SelectedStyle="\APASixthEditionOfficeOnline.xsl" StyleName="APA" Version="6"/>
+<p:properties xmlns:p="http://schemas.microsoft.com/office/2006/metadata/properties" xmlns:xsi="http://www.w3.org/2001/XMLSchema-instance" xmlns:pc="http://schemas.microsoft.com/office/infopath/2007/PartnerControls">
+  <documentManagement>
+    <_activity xmlns="73bd2b1f-886a-4f1d-b0bb-23f49d491aa9" xsi:nil="true"/>
+  </documentManagement>
+</p:properties>
 </file>
 
 <file path=customXml/item2.xml><?xml version="1.0" encoding="utf-8"?>
-<?mso-contentType ?>
-<FormTemplates xmlns="http://schemas.microsoft.com/sharepoint/v3/contenttype/forms">
-  <Display>DocumentLibraryForm</Display>
-  <Edit>DocumentLibraryForm</Edit>
-  <New>DocumentLibraryForm</New>
-</FormTemplates>
-</file>
-
-<file path=customXml/item3.xml><?xml version="1.0" encoding="utf-8"?>
 <ct:contentTypeSchema xmlns:ct="http://schemas.microsoft.com/office/2006/metadata/contentType" xmlns:ma="http://schemas.microsoft.com/office/2006/metadata/properties/metaAttributes" ct:_="" ma:_="" ma:contentTypeName="Documento" ma:contentTypeID="0x010100B048A1A6D184364FB502BBB6EBF2C3D9" ma:contentTypeVersion="14" ma:contentTypeDescription="Crie um novo documento." ma:contentTypeScope="" ma:versionID="d7146710810563b9c6e4c1a91b60f5f9">
   <xsd:schema xmlns:xsd="http://www.w3.org/2001/XMLSchema" xmlns:xs="http://www.w3.org/2001/XMLSchema" xmlns:p="http://schemas.microsoft.com/office/2006/metadata/properties" xmlns:ns3="73bd2b1f-886a-4f1d-b0bb-23f49d491aa9" xmlns:ns4="85818a3c-b8e7-4f75-b80a-610982c277d3" targetNamespace="http://schemas.microsoft.com/office/2006/metadata/properties" ma:root="true" ma:fieldsID="8b8875638ef7369d6012dd60a980de1b" ns3:_="" ns4:_="">
     <xsd:import namespace="73bd2b1f-886a-4f1d-b0bb-23f49d491aa9"/>
@@ -4567,31 +4678,30 @@
 </ct:contentTypeSchema>
 </file>
 
+<file path=customXml/item3.xml><?xml version="1.0" encoding="utf-8"?>
+<b:Sources xmlns:b="http://schemas.openxmlformats.org/officeDocument/2006/bibliography" xmlns="http://schemas.openxmlformats.org/officeDocument/2006/bibliography" SelectedStyle="\APASixthEditionOfficeOnline.xsl" StyleName="APA" Version="6"/>
+</file>
+
 <file path=customXml/item4.xml><?xml version="1.0" encoding="utf-8"?>
-<p:properties xmlns:p="http://schemas.microsoft.com/office/2006/metadata/properties" xmlns:xsi="http://www.w3.org/2001/XMLSchema-instance" xmlns:pc="http://schemas.microsoft.com/office/infopath/2007/PartnerControls">
-  <documentManagement>
-    <_activity xmlns="73bd2b1f-886a-4f1d-b0bb-23f49d491aa9" xsi:nil="true"/>
-  </documentManagement>
-</p:properties>
+<?mso-contentType ?>
+<FormTemplates xmlns="http://schemas.microsoft.com/sharepoint/v3/contenttype/forms">
+  <Display>DocumentLibraryForm</Display>
+  <Edit>DocumentLibraryForm</Edit>
+  <New>DocumentLibraryForm</New>
+</FormTemplates>
 </file>
 
 <file path=customXml/itemProps1.xml><?xml version="1.0" encoding="utf-8"?>
-<ds:datastoreItem xmlns:ds="http://schemas.openxmlformats.org/officeDocument/2006/customXml" ds:itemID="{F61111CE-2DDF-46E8-9D66-B3D8C921A39E}">
+<ds:datastoreItem xmlns:ds="http://schemas.openxmlformats.org/officeDocument/2006/customXml" ds:itemID="{10811A0B-354D-477E-AF27-C929DD9532C2}">
   <ds:schemaRefs>
-    <ds:schemaRef ds:uri="http://schemas.openxmlformats.org/officeDocument/2006/bibliography"/>
+    <ds:schemaRef ds:uri="http://schemas.microsoft.com/office/2006/metadata/properties"/>
+    <ds:schemaRef ds:uri="http://schemas.microsoft.com/office/infopath/2007/PartnerControls"/>
+    <ds:schemaRef ds:uri="73bd2b1f-886a-4f1d-b0bb-23f49d491aa9"/>
   </ds:schemaRefs>
 </ds:datastoreItem>
 </file>
 
 <file path=customXml/itemProps2.xml><?xml version="1.0" encoding="utf-8"?>
-<ds:datastoreItem xmlns:ds="http://schemas.openxmlformats.org/officeDocument/2006/customXml" ds:itemID="{0593B9FC-456C-46BA-ABE7-4E86A6CE6864}">
-  <ds:schemaRefs>
-    <ds:schemaRef ds:uri="http://schemas.microsoft.com/sharepoint/v3/contenttype/forms"/>
-  </ds:schemaRefs>
-</ds:datastoreItem>
-</file>
-
-<file path=customXml/itemProps3.xml><?xml version="1.0" encoding="utf-8"?>
 <ds:datastoreItem xmlns:ds="http://schemas.openxmlformats.org/officeDocument/2006/customXml" ds:itemID="{D06ADA8E-DF43-49D2-A0A1-50B9B3A2B035}">
   <ds:schemaRefs>
     <ds:schemaRef ds:uri="http://schemas.microsoft.com/office/2006/metadata/contentType"/>
@@ -4610,12 +4720,18 @@
 </ds:datastoreItem>
 </file>
 
+<file path=customXml/itemProps3.xml><?xml version="1.0" encoding="utf-8"?>
+<ds:datastoreItem xmlns:ds="http://schemas.openxmlformats.org/officeDocument/2006/customXml" ds:itemID="{F61111CE-2DDF-46E8-9D66-B3D8C921A39E}">
+  <ds:schemaRefs>
+    <ds:schemaRef ds:uri="http://schemas.openxmlformats.org/officeDocument/2006/bibliography"/>
+  </ds:schemaRefs>
+</ds:datastoreItem>
+</file>
+
 <file path=customXml/itemProps4.xml><?xml version="1.0" encoding="utf-8"?>
-<ds:datastoreItem xmlns:ds="http://schemas.openxmlformats.org/officeDocument/2006/customXml" ds:itemID="{10811A0B-354D-477E-AF27-C929DD9532C2}">
+<ds:datastoreItem xmlns:ds="http://schemas.openxmlformats.org/officeDocument/2006/customXml" ds:itemID="{0593B9FC-456C-46BA-ABE7-4E86A6CE6864}">
   <ds:schemaRefs>
-    <ds:schemaRef ds:uri="http://schemas.microsoft.com/office/2006/metadata/properties"/>
-    <ds:schemaRef ds:uri="http://schemas.microsoft.com/office/infopath/2007/PartnerControls"/>
-    <ds:schemaRef ds:uri="73bd2b1f-886a-4f1d-b0bb-23f49d491aa9"/>
+    <ds:schemaRef ds:uri="http://schemas.microsoft.com/sharepoint/v3/contenttype/forms"/>
   </ds:schemaRefs>
 </ds:datastoreItem>
 </file>
</xml_diff>